<commit_message>
Orden de diagramas de entidad relacion
</commit_message>
<xml_diff>
--- a/Memoria_PlayPdf_TFG.docx
+++ b/Memoria_PlayPdf_TFG.docx
@@ -17,7 +17,7 @@
           <w:noProof/>
         </w:rPr>
         <w:drawing>
-          <wp:anchor distT="0" distB="0" distL="114300" distR="114300" simplePos="0" relativeHeight="251659264" behindDoc="0" locked="0" layoutInCell="1" allowOverlap="1" wp14:anchorId="0E0F74BC" wp14:editId="0F8A2A48">
+          <wp:anchor distT="0" distB="0" distL="114300" distR="114300" simplePos="0" relativeHeight="251659264" behindDoc="0" locked="0" layoutInCell="1" allowOverlap="1" wp14:anchorId="0E0F74BC" wp14:editId="7CCD6EA2">
             <wp:simplePos x="0" y="0"/>
             <wp:positionH relativeFrom="margin">
               <wp:align>left</wp:align>
@@ -227,6 +227,14 @@
     </w:p>
     <w:sdt>
       <w:sdtPr>
+        <w:rPr>
+          <w:rFonts w:asciiTheme="minorHAnsi" w:eastAsiaTheme="minorHAnsi" w:hAnsiTheme="minorHAnsi" w:cstheme="minorBidi"/>
+          <w:b w:val="0"/>
+          <w:color w:val="auto"/>
+          <w:sz w:val="22"/>
+          <w:szCs w:val="22"/>
+          <w:lang w:eastAsia="en-US"/>
+        </w:rPr>
         <w:id w:val="-79836296"/>
         <w:docPartObj>
           <w:docPartGallery w:val="Table of Contents"/>
@@ -235,12 +243,7 @@
       </w:sdtPr>
       <w:sdtEndPr>
         <w:rPr>
-          <w:rFonts w:asciiTheme="minorHAnsi" w:eastAsiaTheme="minorHAnsi" w:hAnsiTheme="minorHAnsi" w:cstheme="minorBidi"/>
           <w:bCs/>
-          <w:color w:val="auto"/>
-          <w:sz w:val="22"/>
-          <w:szCs w:val="22"/>
-          <w:lang w:eastAsia="en-US"/>
         </w:rPr>
       </w:sdtEndPr>
       <w:sdtContent>
@@ -493,21 +496,7 @@
                 <w:rStyle w:val="Hipervnculo"/>
                 <w:noProof/>
               </w:rPr>
-              <w:t>Ro</w:t>
-            </w:r>
-            <w:r>
-              <w:rPr>
-                <w:rStyle w:val="Hipervnculo"/>
-                <w:noProof/>
-              </w:rPr>
-              <w:t>l</w:t>
-            </w:r>
-            <w:r>
-              <w:rPr>
-                <w:rStyle w:val="Hipervnculo"/>
-                <w:noProof/>
-              </w:rPr>
-              <w:t>es</w:t>
+              <w:t>Roles</w:t>
             </w:r>
             <w:r>
               <w:rPr>
@@ -1447,21 +1436,7 @@
                 <w:rStyle w:val="Hipervnculo"/>
                 <w:noProof/>
               </w:rPr>
-              <w:t>Back</w:t>
-            </w:r>
-            <w:r>
-              <w:rPr>
-                <w:rStyle w:val="Hipervnculo"/>
-                <w:noProof/>
-              </w:rPr>
-              <w:t>e</w:t>
-            </w:r>
-            <w:r>
-              <w:rPr>
-                <w:rStyle w:val="Hipervnculo"/>
-                <w:noProof/>
-              </w:rPr>
-              <w:t>nd</w:t>
+              <w:t>Backend</w:t>
             </w:r>
             <w:r>
               <w:rPr>
@@ -3866,13 +3841,7 @@
         <w:jc w:val="both"/>
       </w:pPr>
       <w:r>
-        <w:t>La fecha final de entrega sería aproximadamente el 29 de mayo, así que tenemos que</w:t>
-      </w:r>
-      <w:r>
-        <w:t xml:space="preserve"> </w:t>
-      </w:r>
-      <w:r>
-        <w:t>organizarnos de una manera ordenada:</w:t>
+        <w:t>La fecha final de entrega sería aproximadamente el 29 de mayo, así que tenemos que organizarnos de una manera ordenada:</w:t>
       </w:r>
     </w:p>
     <w:p>
@@ -3881,31 +3850,7 @@
         <w:jc w:val="both"/>
       </w:pPr>
       <w:r>
-        <w:t>Durante las dos primeras semanas, realizar de una manera correcta y detallada todo lo</w:t>
-      </w:r>
-      <w:r>
-        <w:t xml:space="preserve"> </w:t>
-      </w:r>
-      <w:r>
-        <w:t>relacionado con la base de datos, el diagrama entidad-relación, los casos de uso, etc.</w:t>
-      </w:r>
-      <w:r>
-        <w:t xml:space="preserve"> </w:t>
-      </w:r>
-      <w:r>
-        <w:t>Tras realizarla y habiendo comprobado que no nos falta nada, podemos empezar a crear</w:t>
-      </w:r>
-      <w:r>
-        <w:t xml:space="preserve"> </w:t>
-      </w:r>
-      <w:r>
-        <w:t>nuestra página web para ver cómo lo organizamos de manera visual, aunque todavía no tenga</w:t>
-      </w:r>
-      <w:r>
-        <w:t xml:space="preserve"> </w:t>
-      </w:r>
-      <w:r>
-        <w:t xml:space="preserve">funcionalidad. </w:t>
+        <w:t xml:space="preserve">Durante las dos primeras semanas, realizar de una manera correcta y detallada todo lo relacionado con la base de datos, el diagrama entidad-relación, los casos de uso, etc. Tras realizarla y habiendo comprobado que no nos falta nada, podemos empezar a crear nuestra página web para ver cómo lo organizamos de manera visual, aunque todavía no tenga funcionalidad. </w:t>
       </w:r>
     </w:p>
     <w:p>
@@ -3914,19 +3859,7 @@
         <w:jc w:val="both"/>
       </w:pPr>
       <w:r>
-        <w:t>Mientras trabajamos en el Front, también podemos empezar con el Back, así</w:t>
-      </w:r>
-      <w:r>
-        <w:t xml:space="preserve"> </w:t>
-      </w:r>
-      <w:r>
-        <w:t>como preparar las autenticaciones de los usuarios. Esto nos podría llevar entre tres y seis</w:t>
-      </w:r>
-      <w:r>
-        <w:t xml:space="preserve"> </w:t>
-      </w:r>
-      <w:r>
-        <w:t>semanas, dependiendo de cómo lo organicemos.</w:t>
+        <w:t>Mientras trabajamos en el Front, también podemos empezar con el Back, así como preparar las autenticaciones de los usuarios. Esto nos podría llevar entre tres y seis semanas, dependiendo de cómo lo organicemos.</w:t>
       </w:r>
     </w:p>
     <w:p>
@@ -3935,13 +3868,7 @@
         <w:jc w:val="both"/>
       </w:pPr>
       <w:r>
-        <w:t>Una vez terminado el Front, debemos seguir con el Back. Implementar toda la</w:t>
-      </w:r>
-      <w:r>
-        <w:t xml:space="preserve"> </w:t>
-      </w:r>
-      <w:r>
-        <w:t xml:space="preserve">funcionalidad de la que hemos hablado. </w:t>
+        <w:t xml:space="preserve">Una vez terminado el Front, debemos seguir con el Back. Implementar toda la funcionalidad de la que hemos hablado. </w:t>
       </w:r>
     </w:p>
     <w:p>
@@ -3951,22 +3878,7 @@
       </w:pPr>
       <w:r>
         <w:lastRenderedPageBreak/>
-        <w:t>Esta parte será la que más tiempo lleve, suponiendo</w:t>
-      </w:r>
-      <w:r>
-        <w:t xml:space="preserve"> </w:t>
-      </w:r>
-      <w:r>
-        <w:t>que el resto de las cosas se han realizado de una manera correcta. La tendremos terminada a</w:t>
-      </w:r>
-      <w:r>
-        <w:t xml:space="preserve"> </w:t>
-      </w:r>
-      <w:r>
-        <w:t>principios de mayo, como mucho la segunda semana de mayo.</w:t>
-      </w:r>
-      <w:r>
-        <w:t xml:space="preserve"> </w:t>
+        <w:t xml:space="preserve">Esta parte será la que más tiempo lleve, suponiendo que el resto de las cosas se han realizado de una manera correcta. La tendremos terminada a principios de mayo, como mucho la segunda semana de mayo. </w:t>
       </w:r>
     </w:p>
     <w:p>
@@ -3975,19 +3887,7 @@
         <w:jc w:val="both"/>
       </w:pPr>
       <w:r>
-        <w:t xml:space="preserve">Posteriormente debemos de realizar </w:t>
-      </w:r>
-      <w:r>
-        <w:t>las pruebas que necesitemos para comprobar el correcto funcionamiento</w:t>
-      </w:r>
-      <w:r>
-        <w:t xml:space="preserve"> de nuestra aplicación que nos llevará más o</w:t>
-      </w:r>
-      <w:r>
-        <w:t xml:space="preserve"> </w:t>
-      </w:r>
-      <w:r>
-        <w:t>menos dos semanas.</w:t>
+        <w:t>Posteriormente debemos de realizar las pruebas que necesitemos para comprobar el correcto funcionamiento de nuestra aplicación que nos llevará más o menos dos semanas.</w:t>
       </w:r>
     </w:p>
     <w:p>
@@ -4954,6 +4854,9 @@
     <w:p/>
     <w:p>
       <w:r>
+        <w:rPr>
+          <w:noProof/>
+        </w:rPr>
         <w:drawing>
           <wp:inline distT="0" distB="0" distL="0" distR="0" wp14:anchorId="2405AC05" wp14:editId="2C26157E">
             <wp:extent cx="5400040" cy="3132455"/>
@@ -7633,10 +7536,10 @@
     <w:p/>
     <w:p>
       <w:pPr>
-        <w:jc w:val="both"/>
-      </w:pPr>
-      <w:r>
-        <w:t>El modelo de datos está formado por las siguientes tablas:</w:t>
+        <w:pStyle w:val="Ttulo3"/>
+      </w:pPr>
+      <w:r>
+        <w:t>Modelo entidad relación</w:t>
       </w:r>
     </w:p>
     <w:p/>
@@ -7644,12 +7547,14 @@
       <w:pPr>
         <w:jc w:val="center"/>
       </w:pPr>
+    </w:p>
+    <w:p>
       <w:r>
         <w:drawing>
-          <wp:inline distT="0" distB="0" distL="0" distR="0" wp14:anchorId="69FE7D61" wp14:editId="0B4D8557">
-            <wp:extent cx="4393826" cy="4709516"/>
-            <wp:effectExtent l="0" t="0" r="6985" b="0"/>
-            <wp:docPr id="1636756112" name="Imagen 1"/>
+          <wp:inline distT="0" distB="0" distL="0" distR="0" wp14:anchorId="62793C1C" wp14:editId="62D35075">
+            <wp:extent cx="5400040" cy="3464560"/>
+            <wp:effectExtent l="0" t="0" r="0" b="2540"/>
+            <wp:docPr id="1221041529" name="Imagen 1"/>
             <wp:cNvGraphicFramePr>
               <a:graphicFrameLocks xmlns:a="http://schemas.openxmlformats.org/drawingml/2006/main" noChangeAspect="1"/>
             </wp:cNvGraphicFramePr>
@@ -7657,7 +7562,7 @@
               <a:graphicData uri="http://schemas.openxmlformats.org/drawingml/2006/picture">
                 <pic:pic xmlns:pic="http://schemas.openxmlformats.org/drawingml/2006/picture">
                   <pic:nvPicPr>
-                    <pic:cNvPr id="1636756112" name=""/>
+                    <pic:cNvPr id="1221041529" name=""/>
                     <pic:cNvPicPr/>
                   </pic:nvPicPr>
                   <pic:blipFill>
@@ -7669,7 +7574,7 @@
                   <pic:spPr>
                     <a:xfrm>
                       <a:off x="0" y="0"/>
-                      <a:ext cx="4397527" cy="4713483"/>
+                      <a:ext cx="5400040" cy="3464560"/>
                     </a:xfrm>
                     <a:prstGeom prst="rect">
                       <a:avLst/>
@@ -7682,16 +7587,121 @@
         </w:drawing>
       </w:r>
     </w:p>
+    <w:p/>
+    <w:p/>
+    <w:p/>
+    <w:p/>
+    <w:p/>
+    <w:p/>
+    <w:p/>
+    <w:p/>
+    <w:p/>
+    <w:p/>
+    <w:p/>
+    <w:p>
+      <w:pPr>
+        <w:pStyle w:val="Ttulo3"/>
+      </w:pPr>
+      <w:r>
+        <w:lastRenderedPageBreak/>
+        <w:t>Modelo entidad relación</w:t>
+      </w:r>
+    </w:p>
+    <w:p>
+      <w:pPr>
+        <w:jc w:val="center"/>
+      </w:pPr>
+    </w:p>
+    <w:p>
+      <w:pPr>
+        <w:jc w:val="center"/>
+      </w:pPr>
+      <w:r>
+        <w:drawing>
+          <wp:inline distT="0" distB="0" distL="0" distR="0" wp14:anchorId="3FE5ED4C" wp14:editId="6E9D9982">
+            <wp:extent cx="5400040" cy="5678805"/>
+            <wp:effectExtent l="0" t="0" r="0" b="0"/>
+            <wp:docPr id="1431914040" name="Imagen 1"/>
+            <wp:cNvGraphicFramePr>
+              <a:graphicFrameLocks xmlns:a="http://schemas.openxmlformats.org/drawingml/2006/main" noChangeAspect="1"/>
+            </wp:cNvGraphicFramePr>
+            <a:graphic xmlns:a="http://schemas.openxmlformats.org/drawingml/2006/main">
+              <a:graphicData uri="http://schemas.openxmlformats.org/drawingml/2006/picture">
+                <pic:pic xmlns:pic="http://schemas.openxmlformats.org/drawingml/2006/picture">
+                  <pic:nvPicPr>
+                    <pic:cNvPr id="1431914040" name=""/>
+                    <pic:cNvPicPr/>
+                  </pic:nvPicPr>
+                  <pic:blipFill>
+                    <a:blip r:embed="rId14"/>
+                    <a:stretch>
+                      <a:fillRect/>
+                    </a:stretch>
+                  </pic:blipFill>
+                  <pic:spPr>
+                    <a:xfrm>
+                      <a:off x="0" y="0"/>
+                      <a:ext cx="5400040" cy="5678805"/>
+                    </a:xfrm>
+                    <a:prstGeom prst="rect">
+                      <a:avLst/>
+                    </a:prstGeom>
+                  </pic:spPr>
+                </pic:pic>
+              </a:graphicData>
+            </a:graphic>
+          </wp:inline>
+        </w:drawing>
+      </w:r>
+    </w:p>
+    <w:p>
+      <w:pPr>
+        <w:jc w:val="center"/>
+      </w:pPr>
+    </w:p>
+    <w:p>
+      <w:pPr>
+        <w:jc w:val="center"/>
+      </w:pPr>
+    </w:p>
+    <w:p>
+      <w:pPr>
+        <w:jc w:val="center"/>
+      </w:pPr>
+    </w:p>
+    <w:p>
+      <w:pPr>
+        <w:jc w:val="center"/>
+      </w:pPr>
+    </w:p>
+    <w:p>
+      <w:pPr>
+        <w:jc w:val="center"/>
+      </w:pPr>
+    </w:p>
+    <w:p>
+      <w:pPr>
+        <w:jc w:val="center"/>
+      </w:pPr>
+    </w:p>
+    <w:p>
+      <w:pPr>
+        <w:jc w:val="center"/>
+      </w:pPr>
+    </w:p>
+    <w:p>
+      <w:pPr>
+        <w:jc w:val="center"/>
+      </w:pPr>
+    </w:p>
     <w:p>
       <w:pPr>
         <w:pStyle w:val="Ttulo1"/>
       </w:pPr>
       <w:bookmarkStart w:id="19" w:name="_Toc230719627"/>
       <w:r>
-        <w:t>A</w:t>
-      </w:r>
-      <w:r>
-        <w:t>rquitectura de la aplicación</w:t>
+        <w:lastRenderedPageBreak/>
+        <w:t>Arquitectura de la aplicación</w:t>
       </w:r>
       <w:bookmarkEnd w:id="19"/>
     </w:p>
@@ -7729,7 +7739,6 @@
         <w:rPr>
           <w:lang w:val="en-GB"/>
         </w:rPr>
-        <w:lastRenderedPageBreak/>
         <w:t xml:space="preserve">Backend (Spring Boot - </w:t>
       </w:r>
       <w:proofErr w:type="spellStart"/>
@@ -8168,7 +8177,6 @@
       </w:pPr>
       <w:bookmarkStart w:id="23" w:name="_Toc230719631"/>
       <w:r>
-        <w:lastRenderedPageBreak/>
         <w:t>Librerías externas utilizadas</w:t>
       </w:r>
       <w:bookmarkEnd w:id="23"/>
@@ -9557,12 +9565,12 @@
       </w:r>
     </w:p>
     <w:sectPr>
-      <w:headerReference w:type="even" r:id="rId14"/>
-      <w:headerReference w:type="default" r:id="rId15"/>
-      <w:footerReference w:type="even" r:id="rId16"/>
-      <w:footerReference w:type="default" r:id="rId17"/>
-      <w:headerReference w:type="first" r:id="rId18"/>
-      <w:footerReference w:type="first" r:id="rId19"/>
+      <w:headerReference w:type="even" r:id="rId15"/>
+      <w:headerReference w:type="default" r:id="rId16"/>
+      <w:footerReference w:type="even" r:id="rId17"/>
+      <w:footerReference w:type="default" r:id="rId18"/>
+      <w:headerReference w:type="first" r:id="rId19"/>
+      <w:footerReference w:type="first" r:id="rId20"/>
       <w:pgSz w:w="11906" w:h="16838"/>
       <w:pgMar w:top="1417" w:right="1701" w:bottom="1417" w:left="1701" w:header="708" w:footer="708" w:gutter="0"/>
       <w:cols w:space="708"/>
@@ -10828,6 +10836,36 @@
   </w:num>
   <w:num w:numId="10" w16cid:durableId="1170876123">
     <w:abstractNumId w:val="7"/>
+  </w:num>
+  <w:num w:numId="11" w16cid:durableId="1882088266">
+    <w:abstractNumId w:val="7"/>
+    <w:lvlOverride w:ilvl="0">
+      <w:startOverride w:val="1"/>
+    </w:lvlOverride>
+    <w:lvlOverride w:ilvl="1">
+      <w:startOverride w:val="1"/>
+    </w:lvlOverride>
+    <w:lvlOverride w:ilvl="2">
+      <w:startOverride w:val="1"/>
+    </w:lvlOverride>
+    <w:lvlOverride w:ilvl="3">
+      <w:startOverride w:val="1"/>
+    </w:lvlOverride>
+    <w:lvlOverride w:ilvl="4">
+      <w:startOverride w:val="1"/>
+    </w:lvlOverride>
+    <w:lvlOverride w:ilvl="5">
+      <w:startOverride w:val="1"/>
+    </w:lvlOverride>
+    <w:lvlOverride w:ilvl="6">
+      <w:startOverride w:val="1"/>
+    </w:lvlOverride>
+    <w:lvlOverride w:ilvl="7">
+      <w:startOverride w:val="1"/>
+    </w:lvlOverride>
+    <w:lvlOverride w:ilvl="8">
+      <w:startOverride w:val="1"/>
+    </w:lvlOverride>
   </w:num>
   <w:numIdMacAtCleanup w:val="9"/>
 </w:numbering>
@@ -12211,19 +12249,6 @@
 </file>
 
 <file path=customXml/item2.xml><?xml version="1.0" encoding="utf-8"?>
-<?mso-contentType ?>
-<FormTemplates xmlns="http://schemas.microsoft.com/sharepoint/v3/contenttype/forms">
-  <Display>DocumentLibraryForm</Display>
-  <Edit>DocumentLibraryForm</Edit>
-  <New>DocumentLibraryForm</New>
-</FormTemplates>
-</file>
-
-<file path=customXml/item3.xml><?xml version="1.0" encoding="utf-8"?>
-<b:Sources xmlns:b="http://schemas.openxmlformats.org/officeDocument/2006/bibliography" xmlns="http://schemas.openxmlformats.org/officeDocument/2006/bibliography" SelectedStyle="\APASixthEditionOfficeOnline.xsl" StyleName="APA" Version="6"/>
-</file>
-
-<file path=customXml/item4.xml><?xml version="1.0" encoding="utf-8"?>
 <ct:contentTypeSchema xmlns:ct="http://schemas.microsoft.com/office/2006/metadata/contentType" xmlns:ma="http://schemas.microsoft.com/office/2006/metadata/properties/metaAttributes" ct:_="" ma:_="" ma:contentTypeName="Documento" ma:contentTypeID="0x010100C62BA20E8D966040A082E36E8561CD84" ma:contentTypeVersion="18" ma:contentTypeDescription="Crear nuevo documento." ma:contentTypeScope="" ma:versionID="3fb87f32056febf5c27be5220828e678">
   <xsd:schema xmlns:xsd="http://www.w3.org/2001/XMLSchema" xmlns:xs="http://www.w3.org/2001/XMLSchema" xmlns:p="http://schemas.microsoft.com/office/2006/metadata/properties" xmlns:ns2="8fcaa2d4-51b8-4b8f-b7bc-98cf4b2177e8" xmlns:ns3="c3614af2-e635-4072-be10-70b8c906c008" targetNamespace="http://schemas.microsoft.com/office/2006/metadata/properties" ma:root="true" ma:fieldsID="7ccced0006375d94c23fe053fe4bfd03" ns2:_="" ns3:_="">
     <xsd:import namespace="8fcaa2d4-51b8-4b8f-b7bc-98cf4b2177e8"/>
@@ -12478,6 +12503,19 @@
 </ct:contentTypeSchema>
 </file>
 
+<file path=customXml/item3.xml><?xml version="1.0" encoding="utf-8"?>
+<b:Sources xmlns:b="http://schemas.openxmlformats.org/officeDocument/2006/bibliography" xmlns="http://schemas.openxmlformats.org/officeDocument/2006/bibliography" SelectedStyle="\APASixthEditionOfficeOnline.xsl" StyleName="APA" Version="6"/>
+</file>
+
+<file path=customXml/item4.xml><?xml version="1.0" encoding="utf-8"?>
+<?mso-contentType ?>
+<FormTemplates xmlns="http://schemas.microsoft.com/sharepoint/v3/contenttype/forms">
+  <Display>DocumentLibraryForm</Display>
+  <Edit>DocumentLibraryForm</Edit>
+  <New>DocumentLibraryForm</New>
+</FormTemplates>
+</file>
+
 <file path=customXml/itemProps1.xml><?xml version="1.0" encoding="utf-8"?>
 <ds:datastoreItem xmlns:ds="http://schemas.openxmlformats.org/officeDocument/2006/customXml" ds:itemID="{88A6ECAC-0B71-40C3-919D-6A07C4453A27}">
   <ds:schemaRefs>
@@ -12490,22 +12528,6 @@
 </file>
 
 <file path=customXml/itemProps2.xml><?xml version="1.0" encoding="utf-8"?>
-<ds:datastoreItem xmlns:ds="http://schemas.openxmlformats.org/officeDocument/2006/customXml" ds:itemID="{7ACF66F9-DA77-4432-A9F8-7B88E125BEC2}">
-  <ds:schemaRefs>
-    <ds:schemaRef ds:uri="http://schemas.microsoft.com/sharepoint/v3/contenttype/forms"/>
-  </ds:schemaRefs>
-</ds:datastoreItem>
-</file>
-
-<file path=customXml/itemProps3.xml><?xml version="1.0" encoding="utf-8"?>
-<ds:datastoreItem xmlns:ds="http://schemas.openxmlformats.org/officeDocument/2006/customXml" ds:itemID="{0C031396-AFEC-4AD9-A87F-290EDFB2B80E}">
-  <ds:schemaRefs>
-    <ds:schemaRef ds:uri="http://schemas.openxmlformats.org/officeDocument/2006/bibliography"/>
-  </ds:schemaRefs>
-</ds:datastoreItem>
-</file>
-
-<file path=customXml/itemProps4.xml><?xml version="1.0" encoding="utf-8"?>
 <ds:datastoreItem xmlns:ds="http://schemas.openxmlformats.org/officeDocument/2006/customXml" ds:itemID="{3467B138-4EC8-4BDA-AD9B-30A6F24A2637}">
   <ds:schemaRefs>
     <ds:schemaRef ds:uri="http://schemas.microsoft.com/office/2006/metadata/contentType"/>
@@ -12522,4 +12544,20 @@
     <ds:schemaRef ds:uri="http://schemas.microsoft.com/internal/obd"/>
   </ds:schemaRefs>
 </ds:datastoreItem>
+</file>
+
+<file path=customXml/itemProps3.xml><?xml version="1.0" encoding="utf-8"?>
+<ds:datastoreItem xmlns:ds="http://schemas.openxmlformats.org/officeDocument/2006/customXml" ds:itemID="{0C031396-AFEC-4AD9-A87F-290EDFB2B80E}">
+  <ds:schemaRefs>
+    <ds:schemaRef ds:uri="http://schemas.openxmlformats.org/officeDocument/2006/bibliography"/>
+  </ds:schemaRefs>
+</ds:datastoreItem>
+</file>
+
+<file path=customXml/itemProps4.xml><?xml version="1.0" encoding="utf-8"?>
+<ds:datastoreItem xmlns:ds="http://schemas.openxmlformats.org/officeDocument/2006/customXml" ds:itemID="{7ACF66F9-DA77-4432-A9F8-7B88E125BEC2}">
+  <ds:schemaRefs>
+    <ds:schemaRef ds:uri="http://schemas.microsoft.com/sharepoint/v3/contenttype/forms"/>
+  </ds:schemaRefs>
+</ds:datastoreItem>
 </file>
</xml_diff>

<commit_message>
Diagrama de Clases en la memoria
</commit_message>
<xml_diff>
--- a/Memoria_PlayPdf_TFG.docx
+++ b/Memoria_PlayPdf_TFG.docx
@@ -1,6 +1,6 @@
 
 <file path=word/document.xml><?xml version="1.0" encoding="utf-8"?>
-<w:document xmlns:wpc="http://schemas.microsoft.com/office/word/2010/wordprocessingCanvas" xmlns:cx="http://schemas.microsoft.com/office/drawing/2014/chartex" xmlns:cx1="http://schemas.microsoft.com/office/drawing/2015/9/8/chartex" xmlns:cx2="http://schemas.microsoft.com/office/drawing/2015/10/21/chartex" xmlns:cx3="http://schemas.microsoft.com/office/drawing/2016/5/9/chartex" xmlns:cx4="http://schemas.microsoft.com/office/drawing/2016/5/10/chartex" xmlns:cx5="http://schemas.microsoft.com/office/drawing/2016/5/11/chartex" xmlns:cx6="http://schemas.microsoft.com/office/drawing/2016/5/12/chartex" xmlns:cx7="http://schemas.microsoft.com/office/drawing/2016/5/13/chartex" xmlns:cx8="http://schemas.microsoft.com/office/drawing/2016/5/14/chartex" xmlns:mc="http://schemas.openxmlformats.org/markup-compatibility/2006" xmlns:aink="http://schemas.microsoft.com/office/drawing/2016/ink" xmlns:am3d="http://schemas.microsoft.com/office/drawing/2017/model3d" xmlns:o="urn:schemas-microsoft-com:office:office" xmlns:oel="http://schemas.microsoft.com/office/2019/extlst" xmlns:r="http://schemas.openxmlformats.org/officeDocument/2006/relationships" xmlns:m="http://schemas.openxmlformats.org/officeDocument/2006/math" xmlns:v="urn:schemas-microsoft-com:vml" xmlns:wp14="http://schemas.microsoft.com/office/word/2010/wordprocessingDrawing" xmlns:wp="http://schemas.openxmlformats.org/drawingml/2006/wordprocessingDrawing" xmlns:w10="urn:schemas-microsoft-com:office:word" xmlns:w="http://schemas.openxmlformats.org/wordprocessingml/2006/main" xmlns:w14="http://schemas.microsoft.com/office/word/2010/wordml" xmlns:w15="http://schemas.microsoft.com/office/word/2012/wordml" xmlns:w16cex="http://schemas.microsoft.com/office/word/2018/wordml/cex" xmlns:w16cid="http://schemas.microsoft.com/office/word/2016/wordml/cid" xmlns:w16="http://schemas.microsoft.com/office/word/2018/wordml" xmlns:w16du="http://schemas.microsoft.com/office/word/2023/wordml/word16du" xmlns:w16sdtdh="http://schemas.microsoft.com/office/word/2020/wordml/sdtdatahash" xmlns:w16sdtfl="http://schemas.microsoft.com/office/word/2024/wordml/sdtformatlock" xmlns:w16se="http://schemas.microsoft.com/office/word/2015/wordml/symex" xmlns:wpg="http://schemas.microsoft.com/office/word/2010/wordprocessingGroup" xmlns:wpi="http://schemas.microsoft.com/office/word/2010/wordprocessingInk" xmlns:wne="http://schemas.microsoft.com/office/word/2006/wordml" xmlns:wps="http://schemas.microsoft.com/office/word/2010/wordprocessingShape" mc:Ignorable="w14 w15 w16se w16cid w16 w16cex w16sdtdh w16sdtfl w16du wp14">
+<w:document xmlns:wpc="http://schemas.microsoft.com/office/word/2010/wordprocessingCanvas" xmlns:cx="http://schemas.microsoft.com/office/drawing/2014/chartex" xmlns:cx1="http://schemas.microsoft.com/office/drawing/2015/9/8/chartex" xmlns:cx2="http://schemas.microsoft.com/office/drawing/2015/10/21/chartex" xmlns:cx3="http://schemas.microsoft.com/office/drawing/2016/5/9/chartex" xmlns:cx4="http://schemas.microsoft.com/office/drawing/2016/5/10/chartex" xmlns:cx5="http://schemas.microsoft.com/office/drawing/2016/5/11/chartex" xmlns:cx6="http://schemas.microsoft.com/office/drawing/2016/5/12/chartex" xmlns:cx7="http://schemas.microsoft.com/office/drawing/2016/5/13/chartex" xmlns:cx8="http://schemas.microsoft.com/office/drawing/2016/5/14/chartex" xmlns:mc="http://schemas.openxmlformats.org/markup-compatibility/2006" xmlns:aink="http://schemas.microsoft.com/office/drawing/2016/ink" xmlns:am3d="http://schemas.microsoft.com/office/drawing/2017/model3d" xmlns:o="urn:schemas-microsoft-com:office:office" xmlns:r="http://schemas.openxmlformats.org/officeDocument/2006/relationships" xmlns:m="http://schemas.openxmlformats.org/officeDocument/2006/math" xmlns:v="urn:schemas-microsoft-com:vml" xmlns:wp14="http://schemas.microsoft.com/office/word/2010/wordprocessingDrawing" xmlns:wp="http://schemas.openxmlformats.org/drawingml/2006/wordprocessingDrawing" xmlns:w10="urn:schemas-microsoft-com:office:word" xmlns:w="http://schemas.openxmlformats.org/wordprocessingml/2006/main" xmlns:w14="http://schemas.microsoft.com/office/word/2010/wordml" xmlns:w15="http://schemas.microsoft.com/office/word/2012/wordml" xmlns:w16cex="http://schemas.microsoft.com/office/word/2018/wordml/cex" xmlns:w16cid="http://schemas.microsoft.com/office/word/2016/wordml/cid" xmlns:w16="http://schemas.microsoft.com/office/word/2018/wordml" xmlns:w16sdtdh="http://schemas.microsoft.com/office/word/2020/wordml/sdtdatahash" xmlns:w16se="http://schemas.microsoft.com/office/word/2015/wordml/symex" xmlns:wpg="http://schemas.microsoft.com/office/word/2010/wordprocessingGroup" xmlns:wpi="http://schemas.microsoft.com/office/word/2010/wordprocessingInk" xmlns:wne="http://schemas.microsoft.com/office/word/2006/wordml" xmlns:wps="http://schemas.microsoft.com/office/word/2010/wordprocessingShape" mc:Ignorable="w14 w15 w16se w16cid w16 w16cex w16sdtdh wp14">
   <w:body>
     <w:p>
       <w:pPr>
@@ -3314,7 +3314,10 @@
       </w:r>
       <w:proofErr w:type="spellEnd"/>
       <w:r>
-        <w:t xml:space="preserve"> es una aplicación web educativa cuyo objetivo es transformar el proceso de estudio en una experiencia interactiva y motivadora. El nombre hace referencia a su funcionalidad central: a partir de archivos PDF de temario, la plataforma genera automáticamente minijuegos educativos mediante inteligencia artificial.</w:t>
+        <w:t xml:space="preserve"> es una aplicación web educativa cuyo objetivo es transformar el proceso de estudio en una experiencia interactiva y motivadora. El nombre hace referencia a su funcionalidad central: a partir de archivos PDF de temario, la plataforma genera automáticamente</w:t>
+      </w:r>
+      <w:r>
+        <w:t xml:space="preserve"> minijuegos educativos mediante inteligencia artificial.</w:t>
       </w:r>
     </w:p>
     <w:p/>
@@ -3324,7 +3327,10 @@
         <w:jc w:val="both"/>
       </w:pPr>
       <w:r>
-        <w:t>La aplicación está orientada a entornos académicos de bachillerato, educación secundaria y formación profesional. Está organizada en torno al concepto de centros educativos, dentro de los cuales los profesores gestionan sus asignaturas y temarios, y los alumnos acceden a los juegos generados para estudiar de forma dinámica.</w:t>
+        <w:t>La aplicación está orientada a entornos académicos de bachillerato, educación secundaria y formación profesional. Está organizada en torno al concepto de centros educativos, dentro de los cuales los</w:t>
+      </w:r>
+      <w:r>
+        <w:t xml:space="preserve"> profesores gestionan sus asignaturas y temarios, y los alumnos acceden a los juegos generados para estudiar de forma dinámica.</w:t>
       </w:r>
     </w:p>
     <w:p/>
@@ -3340,7 +3346,13 @@
         <w:t>,</w:t>
       </w:r>
       <w:r>
-        <w:t xml:space="preserve"> pero carecen de herramientas que conviertan ese material estático en contenido interactivo. La integración de una API de inteligencia artificial (Groq con el modelo llama-3.3-70b-versatile) permite generar preguntas tipo test y puzzles de palabras de forma automática a partir del contenido del PDF, eliminando la necesidad de que el profesor las elabore manualmente.</w:t>
+        <w:t xml:space="preserve"> pero carece</w:t>
+      </w:r>
+      <w:r>
+        <w:t>n de herramientas que conviertan ese material estático en contenido interactivo. La integración de una API de inteligencia artificial (Groq con el modelo llama-3.3-70b-versatile) permite generar preguntas tipo test y puzzles de palabras de forma automática</w:t>
+      </w:r>
+      <w:r>
+        <w:t xml:space="preserve"> a partir del contenido del PDF, eliminando la necesidad de que el profesor las elabore manualmente.</w:t>
       </w:r>
     </w:p>
     <w:p>
@@ -3358,7 +3370,10 @@
         <w:jc w:val="both"/>
       </w:pPr>
       <w:r>
-        <w:t>La aplicación cuenta con tres roles de usuario diferenciados, cada uno con sus propias funcionalidades y niveles de acceso.</w:t>
+        <w:t xml:space="preserve">La aplicación cuenta con tres roles de usuario diferenciados, cada uno con sus propias funcionalidades y niveles de </w:t>
+      </w:r>
+      <w:r>
+        <w:t>acceso.</w:t>
       </w:r>
     </w:p>
     <w:p/>
@@ -3434,7 +3449,10 @@
         </w:numPr>
       </w:pPr>
       <w:r>
-        <w:t>Consulta sus estadísticas personales: partidas jugadas, tasa de acierto y racha de partidas perfectas.</w:t>
+        <w:t>Consulta sus estadísticas personales: partidas</w:t>
+      </w:r>
+      <w:r>
+        <w:t xml:space="preserve"> jugadas, tasa de acierto y racha de partidas perfectas.</w:t>
       </w:r>
     </w:p>
     <w:p>
@@ -3499,7 +3517,10 @@
         </w:numPr>
       </w:pPr>
       <w:r>
-        <w:t>Crea, edita y elimina sus propias asignaturas dentro de cada centro.</w:t>
+        <w:t>Crea, edita</w:t>
+      </w:r>
+      <w:r>
+        <w:t xml:space="preserve"> y elimina sus propias asignaturas dentro de cada centro.</w:t>
       </w:r>
     </w:p>
     <w:p>
@@ -3552,7 +3573,10 @@
         </w:numPr>
       </w:pPr>
       <w:r>
-        <w:t>Crea y elimina centros educativos, asignando a cada uno un código de acceso único.</w:t>
+        <w:t>Crea y elimina centros educativos,</w:t>
+      </w:r>
+      <w:r>
+        <w:t xml:space="preserve"> asignando a cada uno un código de acceso único.</w:t>
       </w:r>
     </w:p>
     <w:p>
@@ -3608,7 +3632,10 @@
         <w:jc w:val="both"/>
       </w:pPr>
       <w:r>
-        <w:t>El flujo estándar de uso de PlayPDF es el siguiente:</w:t>
+        <w:t xml:space="preserve">El flujo </w:t>
+      </w:r>
+      <w:r>
+        <w:t>estándar de uso de PlayPDF es el siguiente:</w:t>
       </w:r>
     </w:p>
     <w:p/>
@@ -3633,7 +3660,10 @@
         <w:jc w:val="both"/>
       </w:pPr>
       <w:r>
-        <w:t>3. El profesor sube archivos PDF</w:t>
+        <w:t xml:space="preserve">3. El profesor sube </w:t>
+      </w:r>
+      <w:r>
+        <w:t>archivos PDF</w:t>
       </w:r>
       <w:r>
         <w:t xml:space="preserve"> para</w:t>
@@ -3661,7 +3691,10 @@
         <w:jc w:val="both"/>
       </w:pPr>
       <w:r>
-        <w:t>5. Al terminar la partida, la aplicación registra los resultados y actualiza las estadísticas del alumno.</w:t>
+        <w:t>5. Al terminar la partida, la aplicación registra los res</w:t>
+      </w:r>
+      <w:r>
+        <w:t>ultados y actualiza las estadísticas del alumno.</w:t>
       </w:r>
     </w:p>
     <w:p/>
@@ -3697,7 +3730,10 @@
         <w:jc w:val="both"/>
       </w:pPr>
       <w:r>
-        <w:t>La IA genera 5 preguntas de opción múltiple (4 respuestas, 1 correcta) basadas en el contenido del PDF. El alumno selecciona su respuesta y recibe feedback inmediato con la respuesta correcta resaltada.</w:t>
+        <w:t>La IA genera 5 preguntas de opción múltiple (4 respuestas, 1 correcta) basadas en el contenido del PDF. El alumno selecciona su respuesta y recibe feedback inmediato con la re</w:t>
+      </w:r>
+      <w:r>
+        <w:t>spuesta correcta resaltada.</w:t>
       </w:r>
     </w:p>
     <w:p/>
@@ -3758,7 +3794,10 @@
         <w:jc w:val="both"/>
       </w:pPr>
       <w:r>
-        <w:t>PlayPDF nace como una herramienta educativa orientada a centros de enseñanza secundaria, bachillerato y formación profesional. El modelo de negocio se basa en licencias por centro educativo: cada institución adquiere una suscripción anual que le permite crear su espacio dentro de la plataforma, registrar a sus profesores y alumnos, y generar contenido de estudio de forma ilimitada.</w:t>
+        <w:t>PlayPDF nace como una herramienta educativa orientada a centros de enseñanza secundaria, bachillerato y formación profesional. El modelo de negocio se basa en licencias por centro educativo: cada institución adquiere un</w:t>
+      </w:r>
+      <w:r>
+        <w:t>a suscripción anual que le permite crear su espacio dentro de la plataforma, registrar a sus profesores y alumnos, y generar contenido de estudio de forma ilimitada.</w:t>
       </w:r>
     </w:p>
     <w:p/>
@@ -3778,7 +3817,10 @@
         <w:jc w:val="both"/>
       </w:pPr>
       <w:r>
-        <w:t>La aplicación está desarrollada con tecnologías maduras y ampliamente adoptadas en el mercado laboral: Vue 3 en el frontend, Spring Boot en el backend y MySQL como base de datos. El despliegue se realiza íntegramente mediante contenedores Docker, lo que garantiza portabilidad y reproducibilidad en cualquier entorno.</w:t>
+        <w:t xml:space="preserve">La aplicación está desarrollada con tecnologías maduras y ampliamente </w:t>
+      </w:r>
+      <w:r>
+        <w:t>adoptadas en el mercado laboral: Vue 3 en el frontend, Spring Boot en el backend y MySQL como base de datos. El despliegue se realiza íntegramente mediante contenedores Docker, lo que garantiza portabilidad y reproducibilidad en cualquier entorno.</w:t>
       </w:r>
     </w:p>
     <w:p/>
@@ -3788,7 +3830,10 @@
         <w:jc w:val="both"/>
       </w:pPr>
       <w:r>
-        <w:t xml:space="preserve">La integración con Groq como proveedor de IA aporta velocidad muy superior a otras alternativas, con costes reducidos. El modelo </w:t>
+        <w:t>La inte</w:t>
+      </w:r>
+      <w:r>
+        <w:t xml:space="preserve">gración con Groq como proveedor de IA aporta velocidad muy superior a otras alternativas, con costes reducidos. El modelo </w:t>
       </w:r>
       <w:r>
         <w:t>“</w:t>
@@ -3810,7 +3855,10 @@
       </w:pPr>
       <w:bookmarkStart w:id="8" w:name="_Toc230719616"/>
       <w:r>
-        <w:t>Viabilidad económica</w:t>
+        <w:t>Viabi</w:t>
+      </w:r>
+      <w:r>
+        <w:t>lidad económica</w:t>
       </w:r>
       <w:bookmarkEnd w:id="8"/>
     </w:p>
@@ -3820,7 +3868,10 @@
         <w:jc w:val="both"/>
       </w:pPr>
       <w:r>
-        <w:t>Los costes principales son: infraestructura de servidores, licencia de la API de IA (Groq ofrece un tier gratuito generoso y precios competitivos en producción) y mantenimiento. Los ingresos provendrían de suscripciones anuales por centro, con un modelo freemium para centros pequeños.</w:t>
+        <w:t xml:space="preserve">Los costes principales son: infraestructura de servidores, licencia de la API de IA (Groq ofrece un tier gratuito generoso y precios competitivos en producción) y mantenimiento. Los ingresos provendrían de suscripciones anuales por </w:t>
+      </w:r>
+      <w:r>
+        <w:t>centro, con un modelo freemium para centros pequeños.</w:t>
       </w:r>
     </w:p>
     <w:p/>
@@ -4020,7 +4071,10 @@
           </w:tcPr>
           <w:p>
             <w:r>
-              <w:t>Framework progresivo con Composition API. Permite construir interfaces reactivas de forma modular. Familiaridad del equipo y currículo del ciclo.</w:t>
+              <w:t xml:space="preserve">Framework </w:t>
+            </w:r>
+            <w:r>
+              <w:t>progresivo con Composition API. Permite construir interfaces reactivas de forma modular. Familiaridad del equipo y currículo del ciclo.</w:t>
             </w:r>
           </w:p>
         </w:tc>
@@ -4160,7 +4214,10 @@
           </w:tcPr>
           <w:p>
             <w:r>
-              <w:t>Framework CSS para el sistema de rejilla y componentes base. Combinado con estilos propios mediante variables CSS.</w:t>
+              <w:t>Framework CSS para el sistema de rejilla y componen</w:t>
+            </w:r>
+            <w:r>
+              <w:t>tes base. Combinado con estilos propios mediante variables CSS.</w:t>
             </w:r>
           </w:p>
         </w:tc>
@@ -4304,7 +4361,10 @@
           </w:tcPr>
           <w:p>
             <w:r>
-              <w:t>Lenguaje principal del backend. LTS con soporte a largo plazo.</w:t>
+              <w:t xml:space="preserve">Lenguaje principal del backend. LTS con soporte a largo </w:t>
+            </w:r>
+            <w:r>
+              <w:t>plazo.</w:t>
             </w:r>
           </w:p>
         </w:tc>
@@ -4409,7 +4469,10 @@
           </w:tcPr>
           <w:p>
             <w:r>
-              <w:t>Abstracción sobre Hibernate para el acceso a datos con repositorios.</w:t>
+              <w:t xml:space="preserve">Abstracción sobre Hibernate para el acceso a datos con </w:t>
+            </w:r>
+            <w:r>
+              <w:t>repositorios.</w:t>
             </w:r>
           </w:p>
         </w:tc>
@@ -4514,7 +4577,10 @@
           </w:tcPr>
           <w:p>
             <w:r>
-              <w:t>Extracción de texto de archivos PDF para su procesamiento por la IA.</w:t>
+              <w:t xml:space="preserve">Extracción de texto de </w:t>
+            </w:r>
+            <w:r>
+              <w:t>archivos PDF para su procesamiento por la IA.</w:t>
             </w:r>
           </w:p>
         </w:tc>
@@ -4794,7 +4860,10 @@
           </w:tcPr>
           <w:p>
             <w:r>
-              <w:t>Definición de las imágenes del backend y del frontend. El backend usa una build multietapa (Maven + JRE). El frontend compila Vue con Node y sirve los estáticos con Nginx.</w:t>
+              <w:t xml:space="preserve">Definición de las imágenes del backend y del frontend. El backend usa una build multietapa </w:t>
+            </w:r>
+            <w:r>
+              <w:t>(Maven + JRE). El frontend compila Vue con Node y sirve los estáticos con Nginx.</w:t>
             </w:r>
           </w:p>
         </w:tc>
@@ -4847,7 +4916,10 @@
       </w:pPr>
       <w:bookmarkStart w:id="16" w:name="_Toc230719624"/>
       <w:r>
-        <w:t>Diagramas y definición de casos de uso</w:t>
+        <w:t xml:space="preserve">Diagramas y </w:t>
+      </w:r>
+      <w:r>
+        <w:t>definición de casos de uso</w:t>
       </w:r>
       <w:bookmarkEnd w:id="16"/>
     </w:p>
@@ -5023,7 +5095,10 @@
           </w:tcPr>
           <w:p>
             <w:r>
-              <w:t>Permite a un usuario crear una cuenta como Alumno, Profesor o Administrador. Para los roles Profesor y Administrador se requiere un código de acceso específico.</w:t>
+              <w:t xml:space="preserve">Permite a un </w:t>
+            </w:r>
+            <w:r>
+              <w:t>usuario crear una cuenta como Alumno, Profesor o Administrador. Para los roles Profesor y Administrador se requiere un código de acceso específico.</w:t>
             </w:r>
           </w:p>
         </w:tc>
@@ -5077,7 +5152,10 @@
           </w:tcPr>
           <w:p>
             <w:r>
-              <w:t>Cuenta creada correctamente en el sistema.</w:t>
+              <w:t>Cuenta creada correctamente en</w:t>
+            </w:r>
+            <w:r>
+              <w:t xml:space="preserve"> el sistema.</w:t>
             </w:r>
           </w:p>
         </w:tc>
@@ -5124,7 +5202,10 @@
           </w:p>
           <w:p>
             <w:r>
-              <w:t>5. El sistema valida la información y crea la cuenta.</w:t>
+              <w:t>5. El sistema valida la información y cr</w:t>
+            </w:r>
+            <w:r>
+              <w:t>ea la cuenta.</w:t>
             </w:r>
           </w:p>
         </w:tc>
@@ -5353,7 +5434,10 @@
           </w:tcPr>
           <w:p>
             <w:r>
-              <w:t>1. El usuario introduce email y contraseña.</w:t>
+              <w:t>1. El usuario i</w:t>
+            </w:r>
+            <w:r>
+              <w:t>ntroduce email y contraseña.</w:t>
             </w:r>
           </w:p>
           <w:p>
@@ -5564,7 +5648,10 @@
           </w:tcPr>
           <w:p>
             <w:r>
-              <w:t>Centro creado o eliminado correctamente.</w:t>
+              <w:t>Centro creado o elimin</w:t>
+            </w:r>
+            <w:r>
+              <w:t>ado correctamente.</w:t>
             </w:r>
           </w:p>
         </w:tc>
@@ -5633,7 +5720,10 @@
           </w:tcPr>
           <w:p>
             <w:r>
-              <w:t>Código de acceso ya existente: el sistema notifica el conflicto y solicita otro código.</w:t>
+              <w:t xml:space="preserve">Código de </w:t>
+            </w:r>
+            <w:r>
+              <w:t>acceso ya existente: el sistema notifica el conflicto y solicita otro código.</w:t>
             </w:r>
           </w:p>
         </w:tc>
@@ -5753,7 +5843,10 @@
           </w:tcPr>
           <w:p>
             <w:r>
-              <w:t>Permite al profesor o alumno acceder a un centro educativo introduciendo su código de acceso único.</w:t>
+              <w:t>Permite al profesor o alumno acceder a un centro educativo introduciendo su código de ac</w:t>
+            </w:r>
+            <w:r>
+              <w:t>ceso único.</w:t>
             </w:r>
           </w:p>
         </w:tc>
@@ -5844,7 +5937,10 @@
           </w:p>
           <w:p>
             <w:r>
-              <w:t>3. Introduce el código de acceso del centro.</w:t>
+              <w:t xml:space="preserve">3. </w:t>
+            </w:r>
+            <w:r>
+              <w:t>Introduce el código de acceso del centro.</w:t>
             </w:r>
           </w:p>
           <w:p>
@@ -5969,7 +6065,10 @@
           </w:tcPr>
           <w:p>
             <w:r>
-              <w:t>Profesor</w:t>
+              <w:t>Prof</w:t>
+            </w:r>
+            <w:r>
+              <w:t>esor</w:t>
             </w:r>
           </w:p>
         </w:tc>
@@ -6050,7 +6149,10 @@
           </w:tcPr>
           <w:p>
             <w:r>
-              <w:t>Asignatura creada, actualizada o eliminada correctamente.</w:t>
+              <w:t xml:space="preserve">Asignatura creada, actualizada o eliminada </w:t>
+            </w:r>
+            <w:r>
+              <w:t>correctamente.</w:t>
             </w:r>
           </w:p>
         </w:tc>
@@ -6114,7 +6216,10 @@
           </w:tcPr>
           <w:p>
             <w:r>
-              <w:t>Al eliminar: confirmación previa del usuario.</w:t>
+              <w:t xml:space="preserve">Al eliminar: </w:t>
+            </w:r>
+            <w:r>
+              <w:t>confirmación previa del usuario.</w:t>
             </w:r>
           </w:p>
         </w:tc>
@@ -6326,7 +6431,10 @@
           </w:p>
           <w:p>
             <w:r>
-              <w:t>3. El sistema extrae el texto del PDF y llama a la API de IA para generar preguntas quiz y puzzle.</w:t>
+              <w:t xml:space="preserve">3. El sistema </w:t>
+            </w:r>
+            <w:r>
+              <w:t>extrae el texto del PDF y llama a la API de IA para generar preguntas quiz y puzzle.</w:t>
             </w:r>
           </w:p>
           <w:p>
@@ -6505,7 +6613,10 @@
           </w:tcPr>
           <w:p>
             <w:r>
-              <w:t>Alumno autenticado. Tema con preguntas generadas disponible.</w:t>
+              <w:t>Alumno autenticado. Tema con pregunt</w:t>
+            </w:r>
+            <w:r>
+              <w:t>as generadas disponible.</w:t>
             </w:r>
           </w:p>
         </w:tc>
@@ -6579,7 +6690,10 @@
           </w:p>
           <w:p>
             <w:r>
-              <w:t>5. Al terminar, se muestra la puntuación y se registran las estadísticas.</w:t>
+              <w:t xml:space="preserve">5. Al </w:t>
+            </w:r>
+            <w:r>
+              <w:t>terminar, se muestra la puntuación y se registran las estadísticas.</w:t>
             </w:r>
           </w:p>
         </w:tc>
@@ -6726,7 +6840,10 @@
           </w:tcPr>
           <w:p>
             <w:r>
-              <w:t>Permite al alumno consultar sus estadísticas: partidas jugadas, tasa de acierto, respuestas correctas totales, racha de partidas perfectas y rendimiento por asignatura.</w:t>
+              <w:t xml:space="preserve">Permite al </w:t>
+            </w:r>
+            <w:r>
+              <w:t>alumno consultar sus estadísticas: partidas jugadas, tasa de acierto, respuestas correctas totales, racha de partidas perfectas y rendimiento por asignatura.</w:t>
             </w:r>
           </w:p>
         </w:tc>
@@ -6780,7 +6897,10 @@
           </w:tcPr>
           <w:p>
             <w:r>
-              <w:t>Estadísticas mostradas correctamente.</w:t>
+              <w:t xml:space="preserve">Estadísticas mostradas </w:t>
+            </w:r>
+            <w:r>
+              <w:t>correctamente.</w:t>
             </w:r>
           </w:p>
         </w:tc>
@@ -6878,7 +6998,10 @@
           </w:tcPr>
           <w:p>
             <w:r>
-              <w:t>Ver mapa de centros</w:t>
+              <w:t>Ver m</w:t>
+            </w:r>
+            <w:r>
+              <w:t>apa de centros</w:t>
             </w:r>
           </w:p>
         </w:tc>
@@ -7014,7 +7137,10 @@
           </w:tcPr>
           <w:p>
             <w:r>
-              <w:t>Mapa con los centros mostrado correctamente.</w:t>
+              <w:t xml:space="preserve">Mapa con los centros </w:t>
+            </w:r>
+            <w:r>
+              <w:t>mostrado correctamente.</w:t>
             </w:r>
           </w:p>
         </w:tc>
@@ -7073,7 +7199,10 @@
           </w:tcPr>
           <w:p>
             <w:r>
-              <w:t>Sin centros registrados: se muestra el mapa vacío con mensaje informativo.</w:t>
+              <w:t>Sin centros registrados: se muestra el mapa vacío con mensaje info</w:t>
+            </w:r>
+            <w:r>
+              <w:t>rmativo.</w:t>
             </w:r>
           </w:p>
         </w:tc>
@@ -7458,7 +7587,10 @@
           </w:tcPr>
           <w:p>
             <w:r>
-              <w:t>Lista de usuarios mostrada.</w:t>
+              <w:t xml:space="preserve">Lista de usuarios </w:t>
+            </w:r>
+            <w:r>
+              <w:t>mostrada.</w:t>
             </w:r>
           </w:p>
         </w:tc>
@@ -7521,14 +7653,76 @@
       </w:r>
       <w:bookmarkEnd w:id="17"/>
     </w:p>
+    <w:p>
+      <w:r>
+        <w:rPr>
+          <w:noProof/>
+        </w:rPr>
+        <w:drawing>
+          <wp:anchor distT="0" distB="0" distL="114300" distR="114300" simplePos="0" relativeHeight="251660288" behindDoc="0" locked="0" layoutInCell="1" allowOverlap="1" wp14:anchorId="0C49D0E8" wp14:editId="336223FF">
+            <wp:simplePos x="0" y="0"/>
+            <wp:positionH relativeFrom="margin">
+              <wp:align>right</wp:align>
+            </wp:positionH>
+            <wp:positionV relativeFrom="paragraph">
+              <wp:posOffset>401955</wp:posOffset>
+            </wp:positionV>
+            <wp:extent cx="5400040" cy="6076315"/>
+            <wp:effectExtent l="0" t="0" r="0" b="635"/>
+            <wp:wrapSquare wrapText="bothSides"/>
+            <wp:docPr id="1" name="Imagen 1"/>
+            <wp:cNvGraphicFramePr>
+              <a:graphicFrameLocks xmlns:a="http://schemas.openxmlformats.org/drawingml/2006/main" noChangeAspect="1"/>
+            </wp:cNvGraphicFramePr>
+            <a:graphic xmlns:a="http://schemas.openxmlformats.org/drawingml/2006/main">
+              <a:graphicData uri="http://schemas.openxmlformats.org/drawingml/2006/picture">
+                <pic:pic xmlns:pic="http://schemas.openxmlformats.org/drawingml/2006/picture">
+                  <pic:nvPicPr>
+                    <pic:cNvPr id="1" name="Imagen 1"/>
+                    <pic:cNvPicPr/>
+                  </pic:nvPicPr>
+                  <pic:blipFill>
+                    <a:blip r:embed="rId13">
+                      <a:extLst>
+                        <a:ext uri="{28A0092B-C50C-407E-A947-70E740481C1C}">
+                          <a14:useLocalDpi xmlns:a14="http://schemas.microsoft.com/office/drawing/2010/main" val="0"/>
+                        </a:ext>
+                      </a:extLst>
+                    </a:blip>
+                    <a:stretch>
+                      <a:fillRect/>
+                    </a:stretch>
+                  </pic:blipFill>
+                  <pic:spPr>
+                    <a:xfrm>
+                      <a:off x="0" y="0"/>
+                      <a:ext cx="5400040" cy="6076315"/>
+                    </a:xfrm>
+                    <a:prstGeom prst="rect">
+                      <a:avLst/>
+                    </a:prstGeom>
+                  </pic:spPr>
+                </pic:pic>
+              </a:graphicData>
+            </a:graphic>
+          </wp:anchor>
+        </w:drawing>
+      </w:r>
+    </w:p>
     <w:p/>
     <w:p/>
+    <w:p/>
+    <w:p/>
+    <w:p/>
+    <w:p/>
+    <w:p/>
     <w:p>
       <w:pPr>
         <w:pStyle w:val="Ttulo2"/>
       </w:pPr>
       <w:bookmarkStart w:id="18" w:name="_Toc230719626"/>
       <w:r>
+        <w:lastRenderedPageBreak/>
         <w:t>Modelo entidad relación y modelo de base de datos</w:t>
       </w:r>
       <w:bookmarkEnd w:id="18"/>
@@ -7550,6 +7744,9 @@
     </w:p>
     <w:p>
       <w:r>
+        <w:rPr>
+          <w:noProof/>
+        </w:rPr>
         <w:drawing>
           <wp:inline distT="0" distB="0" distL="0" distR="0" wp14:anchorId="62793C1C" wp14:editId="62D35075">
             <wp:extent cx="5400040" cy="3464560"/>
@@ -7566,7 +7763,7 @@
                     <pic:cNvPicPr/>
                   </pic:nvPicPr>
                   <pic:blipFill>
-                    <a:blip r:embed="rId13"/>
+                    <a:blip r:embed="rId14"/>
                     <a:stretch>
                       <a:fillRect/>
                     </a:stretch>
@@ -7603,20 +7800,23 @@
         <w:pStyle w:val="Ttulo3"/>
       </w:pPr>
       <w:r>
+        <w:t>Modelo entidad relación</w:t>
+      </w:r>
+    </w:p>
+    <w:p>
+      <w:pPr>
+        <w:jc w:val="center"/>
+      </w:pPr>
+    </w:p>
+    <w:p>
+      <w:pPr>
+        <w:jc w:val="center"/>
+      </w:pPr>
+      <w:r>
+        <w:rPr>
+          <w:noProof/>
+        </w:rPr>
         <w:lastRenderedPageBreak/>
-        <w:t>Modelo entidad relación</w:t>
-      </w:r>
-    </w:p>
-    <w:p>
-      <w:pPr>
-        <w:jc w:val="center"/>
-      </w:pPr>
-    </w:p>
-    <w:p>
-      <w:pPr>
-        <w:jc w:val="center"/>
-      </w:pPr>
-      <w:r>
         <w:drawing>
           <wp:inline distT="0" distB="0" distL="0" distR="0" wp14:anchorId="3FE5ED4C" wp14:editId="6E9D9982">
             <wp:extent cx="5400040" cy="5678805"/>
@@ -7633,7 +7833,7 @@
                     <pic:cNvPicPr/>
                   </pic:nvPicPr>
                   <pic:blipFill>
-                    <a:blip r:embed="rId14"/>
+                    <a:blip r:embed="rId15"/>
                     <a:stretch>
                       <a:fillRect/>
                     </a:stretch>
@@ -7700,18 +7900,18 @@
       </w:pPr>
       <w:bookmarkStart w:id="19" w:name="_Toc230719627"/>
       <w:r>
+        <w:t>Arquitectura de la aplicación</w:t>
+      </w:r>
+      <w:bookmarkEnd w:id="19"/>
+    </w:p>
+    <w:p/>
+    <w:p>
+      <w:pPr>
+        <w:pStyle w:val="Ttulo2"/>
+      </w:pPr>
+      <w:bookmarkStart w:id="20" w:name="_Toc230719628"/>
+      <w:r>
         <w:lastRenderedPageBreak/>
-        <w:t>Arquitectura de la aplicación</w:t>
-      </w:r>
-      <w:bookmarkEnd w:id="19"/>
-    </w:p>
-    <w:p/>
-    <w:p>
-      <w:pPr>
-        <w:pStyle w:val="Ttulo2"/>
-      </w:pPr>
-      <w:bookmarkStart w:id="20" w:name="_Toc230719628"/>
-      <w:r>
         <w:t>Estructura del proyecto</w:t>
       </w:r>
       <w:bookmarkEnd w:id="20"/>
@@ -7836,7 +8036,10 @@
           </w:tcPr>
           <w:p>
             <w:r>
-              <w:t>Reciben las peticiones HTTP, delegan en los servicios y devuelven ResponseEntity con los datos o errores.</w:t>
+              <w:t xml:space="preserve">Reciben las peticiones HTTP, delegan en los servicios y devuelven </w:t>
+            </w:r>
+            <w:r>
+              <w:t>ResponseEntity con los datos o errores.</w:t>
             </w:r>
           </w:p>
         </w:tc>
@@ -7884,7 +8087,10 @@
           </w:tcPr>
           <w:p>
             <w:r>
-              <w:t>Interfaces que extienden JpaRepository. Spring Data genera automáticamente las consultas SQL.</w:t>
+              <w:t xml:space="preserve">Interfaces que extienden JpaRepository. Spring Data genera automáticamente las </w:t>
+            </w:r>
+            <w:r>
+              <w:t>consultas SQL.</w:t>
             </w:r>
           </w:p>
         </w:tc>
@@ -7956,7 +8162,10 @@
           </w:tcPr>
           <w:p>
             <w:r>
-              <w:t>Configuración de Spring Security (JWT), CORS, Jackson (serialización snake_case) y almacenamiento de ficheros.</w:t>
+              <w:t xml:space="preserve">Configuración de Spring Security </w:t>
+            </w:r>
+            <w:r>
+              <w:t>(JWT), CORS, Jackson (serialización snake_case) y almacenamiento de ficheros.</w:t>
             </w:r>
           </w:p>
         </w:tc>
@@ -8109,7 +8318,10 @@
           </w:tcPr>
           <w:p>
             <w:r>
-              <w:t>Stores de Pinia: autenticacion.js gestiona el usuario actual y el token JWT.</w:t>
+              <w:t>Stores de Pini</w:t>
+            </w:r>
+            <w:r>
+              <w:t>a: autenticacion.js gestiona el usuario actual y el token JWT.</w:t>
             </w:r>
           </w:p>
         </w:tc>
@@ -8157,7 +8369,10 @@
           </w:tcPr>
           <w:p>
             <w:r>
-              <w:t>index.js define todas las rutas con guardas de navegación que comprueban autenticación y rol.</w:t>
+              <w:t xml:space="preserve">index.js define todas las rutas con guardas de navegación que </w:t>
+            </w:r>
+            <w:r>
+              <w:t>comprueban autenticación y rol.</w:t>
             </w:r>
           </w:p>
         </w:tc>
@@ -8335,7 +8550,10 @@
           </w:tcPr>
           <w:p>
             <w:r>
-              <w:t>Acceso a base de datos mediante repositorios JPA.</w:t>
+              <w:t xml:space="preserve">Acceso a base de datos mediante </w:t>
+            </w:r>
+            <w:r>
+              <w:t>repositorios JPA.</w:t>
             </w:r>
           </w:p>
         </w:tc>
@@ -8475,7 +8693,10 @@
           </w:tcPr>
           <w:p>
             <w:r>
-              <w:t>Extracción de texto de archivos PDF.</w:t>
+              <w:t xml:space="preserve">Extracción de texto de </w:t>
+            </w:r>
+            <w:r>
+              <w:t>archivos PDF.</w:t>
             </w:r>
           </w:p>
         </w:tc>
@@ -8794,7 +9015,10 @@
           </w:tcPr>
           <w:p>
             <w:r>
-              <w:t>Sistema de rejilla y componentes CSS base.</w:t>
+              <w:t xml:space="preserve">Sistema de rejilla y componentes CSS </w:t>
+            </w:r>
+            <w:r>
+              <w:t>base.</w:t>
             </w:r>
           </w:p>
         </w:tc>
@@ -9141,7 +9365,10 @@
         </w:numPr>
       </w:pPr>
       <w:r>
-        <w:t>Mozilla Firefox 110 o superior</w:t>
+        <w:t xml:space="preserve">Mozilla Firefox 110 o </w:t>
+      </w:r>
+      <w:r>
+        <w:t>superior</w:t>
       </w:r>
     </w:p>
     <w:p>
@@ -9192,7 +9419,10 @@
         <w:t>,</w:t>
       </w:r>
       <w:r>
-        <w:t xml:space="preserve"> después cualquier dispositivo puede ejecutar la aplicación completa con un único comando, sin necesidad de tener el código fuente ni compilar nada.</w:t>
+        <w:t xml:space="preserve"> después cualquier dispositivo puede ejec</w:t>
+      </w:r>
+      <w:r>
+        <w:t>utar la aplicación completa con un único comando, sin necesidad de tener el código fuente ni compilar nada.</w:t>
       </w:r>
     </w:p>
     <w:p>
@@ -9201,32 +9431,94 @@
       </w:pPr>
       <w:bookmarkStart w:id="30" w:name="_Toc230719638"/>
       <w:r>
-        <w:t xml:space="preserve">Fase 1 — Publicar las imágenes en Docker </w:t>
+        <w:t>Fase 1 — Publicar las imágenes en Docker Hub (equipo de desarrollo)</w:t>
+      </w:r>
+      <w:bookmarkEnd w:id="30"/>
+    </w:p>
+    <w:p>
+      <w:pPr>
+        <w:jc w:val="both"/>
+      </w:pPr>
+      <w:r>
+        <w:t>Desde la raíz del proyecto, construir y subir las imágenes a Docker Hub:</w:t>
+      </w:r>
+    </w:p>
+    <w:p>
+      <w:pPr>
+        <w:ind w:left="720"/>
+        <w:rPr>
+          <w:lang w:val="en-GB"/>
+        </w:rPr>
+      </w:pPr>
+      <w:r>
+        <w:rPr>
+          <w:rFonts w:ascii="Courier New" w:hAnsi="Courier New"/>
+          <w:b/>
+          <w:lang w:val="en-GB"/>
+        </w:rPr>
+        <w:t xml:space="preserve">docker </w:t>
+      </w:r>
+      <w:r>
+        <w:rPr>
+          <w:rFonts w:ascii="Courier New" w:hAnsi="Courier New"/>
+          <w:b/>
+          <w:lang w:val="en-GB"/>
+        </w:rPr>
+        <w:t xml:space="preserve">build -t </w:t>
+      </w:r>
+      <w:proofErr w:type="spellStart"/>
+      <w:r>
+        <w:rPr>
+          <w:rFonts w:ascii="Courier New" w:hAnsi="Courier New"/>
+          <w:b/>
+          <w:lang w:val="en-GB"/>
+        </w:rPr>
+        <w:t>davidmoriano</w:t>
+      </w:r>
+      <w:proofErr w:type="spellEnd"/>
+      <w:r>
+        <w:rPr>
+          <w:rFonts w:ascii="Courier New" w:hAnsi="Courier New"/>
+          <w:b/>
+          <w:lang w:val="en-GB"/>
+        </w:rPr>
+        <w:t>/</w:t>
+      </w:r>
+      <w:proofErr w:type="spellStart"/>
+      <w:r>
+        <w:rPr>
+          <w:rFonts w:ascii="Courier New" w:hAnsi="Courier New"/>
+          <w:b/>
+          <w:lang w:val="en-GB"/>
+        </w:rPr>
+        <w:t>playpdf</w:t>
+      </w:r>
+      <w:proofErr w:type="spellEnd"/>
+      <w:r>
+        <w:rPr>
+          <w:rFonts w:ascii="Courier New" w:hAnsi="Courier New"/>
+          <w:b/>
+          <w:lang w:val="en-GB"/>
+        </w:rPr>
+        <w:t>-</w:t>
       </w:r>
       <w:proofErr w:type="gramStart"/>
       <w:r>
-        <w:t>Hub</w:t>
+        <w:rPr>
+          <w:rFonts w:ascii="Courier New" w:hAnsi="Courier New"/>
+          <w:b/>
+          <w:lang w:val="en-GB"/>
+        </w:rPr>
+        <w:t>backend .</w:t>
       </w:r>
       <w:proofErr w:type="gramEnd"/>
       <w:r>
-        <w:t xml:space="preserve"> (equipo de desarrollo)</w:t>
-      </w:r>
-      <w:bookmarkEnd w:id="30"/>
-    </w:p>
-    <w:p>
-      <w:pPr>
-        <w:jc w:val="both"/>
-      </w:pPr>
-      <w:r>
-        <w:t xml:space="preserve">Desde la raíz del proyecto, construir y subir las imágenes a Docker </w:t>
-      </w:r>
-      <w:proofErr w:type="gramStart"/>
-      <w:r>
-        <w:t>Hub</w:t>
-      </w:r>
-      <w:proofErr w:type="gramEnd"/>
-      <w:r>
-        <w:t>:</w:t>
+        <w:rPr>
+          <w:rFonts w:ascii="Courier New" w:hAnsi="Courier New"/>
+          <w:b/>
+          <w:lang w:val="en-GB"/>
+        </w:rPr>
+        <w:t>/backend</w:t>
       </w:r>
     </w:p>
     <w:p>
@@ -9260,6 +9552,14 @@
           <w:b/>
           <w:lang w:val="en-GB"/>
         </w:rPr>
+        <w:t xml:space="preserve"> </w:t>
+      </w:r>
+      <w:r>
+        <w:rPr>
+          <w:rFonts w:ascii="Courier New" w:hAnsi="Courier New"/>
+          <w:b/>
+          <w:lang w:val="en-GB"/>
+        </w:rPr>
         <w:t>/</w:t>
       </w:r>
       <w:proofErr w:type="spellStart"/>
@@ -9287,7 +9587,7 @@
           <w:b/>
           <w:lang w:val="en-GB"/>
         </w:rPr>
-        <w:t>backend .</w:t>
+        <w:t>frontend .</w:t>
       </w:r>
       <w:proofErr w:type="gramEnd"/>
       <w:r>
@@ -9296,7 +9596,7 @@
           <w:b/>
           <w:lang w:val="en-GB"/>
         </w:rPr>
-        <w:t>/backend</w:t>
+        <w:t>/frontend</w:t>
       </w:r>
     </w:p>
     <w:p>
@@ -9312,7 +9612,7 @@
           <w:b/>
           <w:lang w:val="en-GB"/>
         </w:rPr>
-        <w:t xml:space="preserve">docker build -t </w:t>
+        <w:t xml:space="preserve">docker push </w:t>
       </w:r>
       <w:proofErr w:type="spellStart"/>
       <w:r>
@@ -9356,25 +9656,7 @@
           <w:b/>
           <w:lang w:val="en-GB"/>
         </w:rPr>
-        <w:t>-</w:t>
-      </w:r>
-      <w:proofErr w:type="gramStart"/>
-      <w:r>
-        <w:rPr>
-          <w:rFonts w:ascii="Courier New" w:hAnsi="Courier New"/>
-          <w:b/>
-          <w:lang w:val="en-GB"/>
-        </w:rPr>
-        <w:t>frontend .</w:t>
-      </w:r>
-      <w:proofErr w:type="gramEnd"/>
-      <w:r>
-        <w:rPr>
-          <w:rFonts w:ascii="Courier New" w:hAnsi="Courier New"/>
-          <w:b/>
-          <w:lang w:val="en-GB"/>
-        </w:rPr>
-        <w:t>/frontend</w:t>
+        <w:t>-backend</w:t>
       </w:r>
     </w:p>
     <w:p>
@@ -9434,68 +9716,15 @@
           <w:b/>
           <w:lang w:val="en-GB"/>
         </w:rPr>
-        <w:t>-backend</w:t>
-      </w:r>
-    </w:p>
-    <w:p>
-      <w:pPr>
-        <w:ind w:left="720"/>
+        <w:t>-frontend</w:t>
+      </w:r>
+    </w:p>
+    <w:p>
+      <w:pPr>
         <w:rPr>
           <w:lang w:val="en-GB"/>
         </w:rPr>
       </w:pPr>
-      <w:r>
-        <w:rPr>
-          <w:rFonts w:ascii="Courier New" w:hAnsi="Courier New"/>
-          <w:b/>
-          <w:lang w:val="en-GB"/>
-        </w:rPr>
-        <w:t xml:space="preserve">docker push </w:t>
-      </w:r>
-      <w:proofErr w:type="spellStart"/>
-      <w:r>
-        <w:rPr>
-          <w:rFonts w:ascii="Courier New" w:hAnsi="Courier New"/>
-          <w:b/>
-          <w:lang w:val="en-GB"/>
-        </w:rPr>
-        <w:t>davidmoriano</w:t>
-      </w:r>
-      <w:proofErr w:type="spellEnd"/>
-      <w:r>
-        <w:rPr>
-          <w:rFonts w:ascii="Courier New" w:hAnsi="Courier New"/>
-          <w:b/>
-          <w:lang w:val="en-GB"/>
-        </w:rPr>
-        <w:t xml:space="preserve"> </w:t>
-      </w:r>
-      <w:r>
-        <w:rPr>
-          <w:rFonts w:ascii="Courier New" w:hAnsi="Courier New"/>
-          <w:b/>
-          <w:lang w:val="en-GB"/>
-        </w:rPr>
-        <w:t>/</w:t>
-      </w:r>
-      <w:proofErr w:type="spellStart"/>
-      <w:r>
-        <w:rPr>
-          <w:rFonts w:ascii="Courier New" w:hAnsi="Courier New"/>
-          <w:b/>
-          <w:lang w:val="en-GB"/>
-        </w:rPr>
-        <w:t>playpdf</w:t>
-      </w:r>
-      <w:proofErr w:type="spellEnd"/>
-      <w:r>
-        <w:rPr>
-          <w:rFonts w:ascii="Courier New" w:hAnsi="Courier New"/>
-          <w:b/>
-          <w:lang w:val="en-GB"/>
-        </w:rPr>
-        <w:t>-frontend</w:t>
-      </w:r>
     </w:p>
     <w:p>
       <w:pPr>
@@ -9513,13 +9742,6 @@
     </w:p>
     <w:p>
       <w:pPr>
-        <w:rPr>
-          <w:lang w:val="en-GB"/>
-        </w:rPr>
-      </w:pPr>
-    </w:p>
-    <w:p>
-      <w:pPr>
         <w:pStyle w:val="Ttulo3"/>
       </w:pPr>
       <w:bookmarkStart w:id="31" w:name="_Toc230719639"/>
@@ -9534,7 +9756,10 @@
         <w:jc w:val="both"/>
       </w:pPr>
       <w:r>
-        <w:t>Solo se necesita tener Docker instalado y el fichero docker-compose.yml del repositorio. Docker descarga las imágenes automáticamente de Docker Hub y levanta los tres contenedores con un único comando:</w:t>
+        <w:t xml:space="preserve">Solo se </w:t>
+      </w:r>
+      <w:r>
+        <w:t>necesita tener Docker instalado y el fichero docker-compose.yml del repositorio. Docker descarga las imágenes automáticamente de Docker Hub y levanta los tres contenedores con un único comando:</w:t>
       </w:r>
     </w:p>
     <w:p>
@@ -9561,16 +9786,19 @@
         </w:rPr>
       </w:pPr>
       <w:r>
-        <w:t>La aplicación queda accesible en http://localhost. El docker-compose.yml crea la red playpdf-red de tipo bridge, arranca MySQL primero, luego el backend y finalmente el frontend. Solo el frontend expone el puerto 80 al exterior.</w:t>
+        <w:t>La aplicación queda accesible en http://loca</w:t>
+      </w:r>
+      <w:r>
+        <w:t>lhost. El docker-compose.yml crea la red playpdf-red de tipo bridge, arranca MySQL primero, luego el backend y finalmente el frontend. Solo el frontend expone el puerto 80 al exterior.</w:t>
       </w:r>
     </w:p>
     <w:sectPr>
-      <w:headerReference w:type="even" r:id="rId15"/>
-      <w:headerReference w:type="default" r:id="rId16"/>
-      <w:footerReference w:type="even" r:id="rId17"/>
-      <w:footerReference w:type="default" r:id="rId18"/>
-      <w:headerReference w:type="first" r:id="rId19"/>
-      <w:footerReference w:type="first" r:id="rId20"/>
+      <w:headerReference w:type="even" r:id="rId16"/>
+      <w:headerReference w:type="default" r:id="rId17"/>
+      <w:footerReference w:type="even" r:id="rId18"/>
+      <w:footerReference w:type="default" r:id="rId19"/>
+      <w:headerReference w:type="first" r:id="rId20"/>
+      <w:footerReference w:type="first" r:id="rId21"/>
       <w:pgSz w:w="11906" w:h="16838"/>
       <w:pgMar w:top="1417" w:right="1701" w:bottom="1417" w:left="1701" w:header="708" w:footer="708" w:gutter="0"/>
       <w:cols w:space="708"/>
@@ -9581,7 +9809,7 @@
 </file>
 
 <file path=word/endnotes.xml><?xml version="1.0" encoding="utf-8"?>
-<w:endnotes xmlns:wpc="http://schemas.microsoft.com/office/word/2010/wordprocessingCanvas" xmlns:cx="http://schemas.microsoft.com/office/drawing/2014/chartex" xmlns:cx1="http://schemas.microsoft.com/office/drawing/2015/9/8/chartex" xmlns:cx2="http://schemas.microsoft.com/office/drawing/2015/10/21/chartex" xmlns:cx3="http://schemas.microsoft.com/office/drawing/2016/5/9/chartex" xmlns:cx4="http://schemas.microsoft.com/office/drawing/2016/5/10/chartex" xmlns:cx5="http://schemas.microsoft.com/office/drawing/2016/5/11/chartex" xmlns:cx6="http://schemas.microsoft.com/office/drawing/2016/5/12/chartex" xmlns:cx7="http://schemas.microsoft.com/office/drawing/2016/5/13/chartex" xmlns:cx8="http://schemas.microsoft.com/office/drawing/2016/5/14/chartex" xmlns:mc="http://schemas.openxmlformats.org/markup-compatibility/2006" xmlns:aink="http://schemas.microsoft.com/office/drawing/2016/ink" xmlns:am3d="http://schemas.microsoft.com/office/drawing/2017/model3d" xmlns:o="urn:schemas-microsoft-com:office:office" xmlns:oel="http://schemas.microsoft.com/office/2019/extlst" xmlns:r="http://schemas.openxmlformats.org/officeDocument/2006/relationships" xmlns:m="http://schemas.openxmlformats.org/officeDocument/2006/math" xmlns:v="urn:schemas-microsoft-com:vml" xmlns:wp14="http://schemas.microsoft.com/office/word/2010/wordprocessingDrawing" xmlns:wp="http://schemas.openxmlformats.org/drawingml/2006/wordprocessingDrawing" xmlns:w10="urn:schemas-microsoft-com:office:word" xmlns:w="http://schemas.openxmlformats.org/wordprocessingml/2006/main" xmlns:w14="http://schemas.microsoft.com/office/word/2010/wordml" xmlns:w15="http://schemas.microsoft.com/office/word/2012/wordml" xmlns:w16cex="http://schemas.microsoft.com/office/word/2018/wordml/cex" xmlns:w16cid="http://schemas.microsoft.com/office/word/2016/wordml/cid" xmlns:w16="http://schemas.microsoft.com/office/word/2018/wordml" xmlns:w16du="http://schemas.microsoft.com/office/word/2023/wordml/word16du" xmlns:w16sdtdh="http://schemas.microsoft.com/office/word/2020/wordml/sdtdatahash" xmlns:w16sdtfl="http://schemas.microsoft.com/office/word/2024/wordml/sdtformatlock" xmlns:w16se="http://schemas.microsoft.com/office/word/2015/wordml/symex" xmlns:wpg="http://schemas.microsoft.com/office/word/2010/wordprocessingGroup" xmlns:wpi="http://schemas.microsoft.com/office/word/2010/wordprocessingInk" xmlns:wne="http://schemas.microsoft.com/office/word/2006/wordml" xmlns:wps="http://schemas.microsoft.com/office/word/2010/wordprocessingShape" mc:Ignorable="w14 w15 w16se w16cid w16 w16cex w16sdtdh w16sdtfl w16du wp14">
+<w:endnotes xmlns:wpc="http://schemas.microsoft.com/office/word/2010/wordprocessingCanvas" xmlns:cx="http://schemas.microsoft.com/office/drawing/2014/chartex" xmlns:cx1="http://schemas.microsoft.com/office/drawing/2015/9/8/chartex" xmlns:cx2="http://schemas.microsoft.com/office/drawing/2015/10/21/chartex" xmlns:cx3="http://schemas.microsoft.com/office/drawing/2016/5/9/chartex" xmlns:cx4="http://schemas.microsoft.com/office/drawing/2016/5/10/chartex" xmlns:cx5="http://schemas.microsoft.com/office/drawing/2016/5/11/chartex" xmlns:cx6="http://schemas.microsoft.com/office/drawing/2016/5/12/chartex" xmlns:cx7="http://schemas.microsoft.com/office/drawing/2016/5/13/chartex" xmlns:cx8="http://schemas.microsoft.com/office/drawing/2016/5/14/chartex" xmlns:mc="http://schemas.openxmlformats.org/markup-compatibility/2006" xmlns:aink="http://schemas.microsoft.com/office/drawing/2016/ink" xmlns:am3d="http://schemas.microsoft.com/office/drawing/2017/model3d" xmlns:o="urn:schemas-microsoft-com:office:office" xmlns:r="http://schemas.openxmlformats.org/officeDocument/2006/relationships" xmlns:m="http://schemas.openxmlformats.org/officeDocument/2006/math" xmlns:v="urn:schemas-microsoft-com:vml" xmlns:wp14="http://schemas.microsoft.com/office/word/2010/wordprocessingDrawing" xmlns:wp="http://schemas.openxmlformats.org/drawingml/2006/wordprocessingDrawing" xmlns:w10="urn:schemas-microsoft-com:office:word" xmlns:w="http://schemas.openxmlformats.org/wordprocessingml/2006/main" xmlns:w14="http://schemas.microsoft.com/office/word/2010/wordml" xmlns:w15="http://schemas.microsoft.com/office/word/2012/wordml" xmlns:w16cex="http://schemas.microsoft.com/office/word/2018/wordml/cex" xmlns:w16cid="http://schemas.microsoft.com/office/word/2016/wordml/cid" xmlns:w16="http://schemas.microsoft.com/office/word/2018/wordml" xmlns:w16sdtdh="http://schemas.microsoft.com/office/word/2020/wordml/sdtdatahash" xmlns:w16se="http://schemas.microsoft.com/office/word/2015/wordml/symex" xmlns:wpg="http://schemas.microsoft.com/office/word/2010/wordprocessingGroup" xmlns:wpi="http://schemas.microsoft.com/office/word/2010/wordprocessingInk" xmlns:wne="http://schemas.microsoft.com/office/word/2006/wordml" xmlns:wps="http://schemas.microsoft.com/office/word/2010/wordprocessingShape" mc:Ignorable="w14 w15 w16se w16cid w16 w16cex w16sdtdh wp14">
   <w:endnote w:type="separator" w:id="-1">
     <w:p>
       <w:pPr>
@@ -9606,7 +9834,7 @@
 </file>
 
 <file path=word/footer1.xml><?xml version="1.0" encoding="utf-8"?>
-<w:ftr xmlns:wpc="http://schemas.microsoft.com/office/word/2010/wordprocessingCanvas" xmlns:cx="http://schemas.microsoft.com/office/drawing/2014/chartex" xmlns:cx1="http://schemas.microsoft.com/office/drawing/2015/9/8/chartex" xmlns:cx2="http://schemas.microsoft.com/office/drawing/2015/10/21/chartex" xmlns:cx3="http://schemas.microsoft.com/office/drawing/2016/5/9/chartex" xmlns:cx4="http://schemas.microsoft.com/office/drawing/2016/5/10/chartex" xmlns:cx5="http://schemas.microsoft.com/office/drawing/2016/5/11/chartex" xmlns:cx6="http://schemas.microsoft.com/office/drawing/2016/5/12/chartex" xmlns:cx7="http://schemas.microsoft.com/office/drawing/2016/5/13/chartex" xmlns:cx8="http://schemas.microsoft.com/office/drawing/2016/5/14/chartex" xmlns:mc="http://schemas.openxmlformats.org/markup-compatibility/2006" xmlns:aink="http://schemas.microsoft.com/office/drawing/2016/ink" xmlns:am3d="http://schemas.microsoft.com/office/drawing/2017/model3d" xmlns:o="urn:schemas-microsoft-com:office:office" xmlns:oel="http://schemas.microsoft.com/office/2019/extlst" xmlns:r="http://schemas.openxmlformats.org/officeDocument/2006/relationships" xmlns:m="http://schemas.openxmlformats.org/officeDocument/2006/math" xmlns:v="urn:schemas-microsoft-com:vml" xmlns:wp14="http://schemas.microsoft.com/office/word/2010/wordprocessingDrawing" xmlns:wp="http://schemas.openxmlformats.org/drawingml/2006/wordprocessingDrawing" xmlns:w10="urn:schemas-microsoft-com:office:word" xmlns:w="http://schemas.openxmlformats.org/wordprocessingml/2006/main" xmlns:w14="http://schemas.microsoft.com/office/word/2010/wordml" xmlns:w15="http://schemas.microsoft.com/office/word/2012/wordml" xmlns:w16cex="http://schemas.microsoft.com/office/word/2018/wordml/cex" xmlns:w16cid="http://schemas.microsoft.com/office/word/2016/wordml/cid" xmlns:w16="http://schemas.microsoft.com/office/word/2018/wordml" xmlns:w16du="http://schemas.microsoft.com/office/word/2023/wordml/word16du" xmlns:w16sdtdh="http://schemas.microsoft.com/office/word/2020/wordml/sdtdatahash" xmlns:w16sdtfl="http://schemas.microsoft.com/office/word/2024/wordml/sdtformatlock" xmlns:w16se="http://schemas.microsoft.com/office/word/2015/wordml/symex" xmlns:wpg="http://schemas.microsoft.com/office/word/2010/wordprocessingGroup" xmlns:wpi="http://schemas.microsoft.com/office/word/2010/wordprocessingInk" xmlns:wne="http://schemas.microsoft.com/office/word/2006/wordml" xmlns:wps="http://schemas.microsoft.com/office/word/2010/wordprocessingShape" mc:Ignorable="w14 w15 w16se w16cid w16 w16cex w16sdtdh w16sdtfl w16du wp14">
+<w:ftr xmlns:wpc="http://schemas.microsoft.com/office/word/2010/wordprocessingCanvas" xmlns:cx="http://schemas.microsoft.com/office/drawing/2014/chartex" xmlns:cx1="http://schemas.microsoft.com/office/drawing/2015/9/8/chartex" xmlns:cx2="http://schemas.microsoft.com/office/drawing/2015/10/21/chartex" xmlns:cx3="http://schemas.microsoft.com/office/drawing/2016/5/9/chartex" xmlns:cx4="http://schemas.microsoft.com/office/drawing/2016/5/10/chartex" xmlns:cx5="http://schemas.microsoft.com/office/drawing/2016/5/11/chartex" xmlns:cx6="http://schemas.microsoft.com/office/drawing/2016/5/12/chartex" xmlns:cx7="http://schemas.microsoft.com/office/drawing/2016/5/13/chartex" xmlns:cx8="http://schemas.microsoft.com/office/drawing/2016/5/14/chartex" xmlns:mc="http://schemas.openxmlformats.org/markup-compatibility/2006" xmlns:aink="http://schemas.microsoft.com/office/drawing/2016/ink" xmlns:am3d="http://schemas.microsoft.com/office/drawing/2017/model3d" xmlns:o="urn:schemas-microsoft-com:office:office" xmlns:r="http://schemas.openxmlformats.org/officeDocument/2006/relationships" xmlns:m="http://schemas.openxmlformats.org/officeDocument/2006/math" xmlns:v="urn:schemas-microsoft-com:vml" xmlns:wp14="http://schemas.microsoft.com/office/word/2010/wordprocessingDrawing" xmlns:wp="http://schemas.openxmlformats.org/drawingml/2006/wordprocessingDrawing" xmlns:w10="urn:schemas-microsoft-com:office:word" xmlns:w="http://schemas.openxmlformats.org/wordprocessingml/2006/main" xmlns:w14="http://schemas.microsoft.com/office/word/2010/wordml" xmlns:w15="http://schemas.microsoft.com/office/word/2012/wordml" xmlns:w16cex="http://schemas.microsoft.com/office/word/2018/wordml/cex" xmlns:w16cid="http://schemas.microsoft.com/office/word/2016/wordml/cid" xmlns:w16="http://schemas.microsoft.com/office/word/2018/wordml" xmlns:w16sdtdh="http://schemas.microsoft.com/office/word/2020/wordml/sdtdatahash" xmlns:w16se="http://schemas.microsoft.com/office/word/2015/wordml/symex" xmlns:wpg="http://schemas.microsoft.com/office/word/2010/wordprocessingGroup" xmlns:wpi="http://schemas.microsoft.com/office/word/2010/wordprocessingInk" xmlns:wne="http://schemas.microsoft.com/office/word/2006/wordml" xmlns:wps="http://schemas.microsoft.com/office/word/2010/wordprocessingShape" mc:Ignorable="w14 w15 w16se w16cid w16 w16cex w16sdtdh wp14">
   <w:p>
     <w:pPr>
       <w:pStyle w:val="Piedepgina"/>
@@ -9616,7 +9844,7 @@
 </file>
 
 <file path=word/footer2.xml><?xml version="1.0" encoding="utf-8"?>
-<w:ftr xmlns:wpc="http://schemas.microsoft.com/office/word/2010/wordprocessingCanvas" xmlns:cx="http://schemas.microsoft.com/office/drawing/2014/chartex" xmlns:cx1="http://schemas.microsoft.com/office/drawing/2015/9/8/chartex" xmlns:cx2="http://schemas.microsoft.com/office/drawing/2015/10/21/chartex" xmlns:cx3="http://schemas.microsoft.com/office/drawing/2016/5/9/chartex" xmlns:cx4="http://schemas.microsoft.com/office/drawing/2016/5/10/chartex" xmlns:cx5="http://schemas.microsoft.com/office/drawing/2016/5/11/chartex" xmlns:cx6="http://schemas.microsoft.com/office/drawing/2016/5/12/chartex" xmlns:cx7="http://schemas.microsoft.com/office/drawing/2016/5/13/chartex" xmlns:cx8="http://schemas.microsoft.com/office/drawing/2016/5/14/chartex" xmlns:mc="http://schemas.openxmlformats.org/markup-compatibility/2006" xmlns:aink="http://schemas.microsoft.com/office/drawing/2016/ink" xmlns:am3d="http://schemas.microsoft.com/office/drawing/2017/model3d" xmlns:o="urn:schemas-microsoft-com:office:office" xmlns:oel="http://schemas.microsoft.com/office/2019/extlst" xmlns:r="http://schemas.openxmlformats.org/officeDocument/2006/relationships" xmlns:m="http://schemas.openxmlformats.org/officeDocument/2006/math" xmlns:v="urn:schemas-microsoft-com:vml" xmlns:wp14="http://schemas.microsoft.com/office/word/2010/wordprocessingDrawing" xmlns:wp="http://schemas.openxmlformats.org/drawingml/2006/wordprocessingDrawing" xmlns:w10="urn:schemas-microsoft-com:office:word" xmlns:w="http://schemas.openxmlformats.org/wordprocessingml/2006/main" xmlns:w14="http://schemas.microsoft.com/office/word/2010/wordml" xmlns:w15="http://schemas.microsoft.com/office/word/2012/wordml" xmlns:w16cex="http://schemas.microsoft.com/office/word/2018/wordml/cex" xmlns:w16cid="http://schemas.microsoft.com/office/word/2016/wordml/cid" xmlns:w16="http://schemas.microsoft.com/office/word/2018/wordml" xmlns:w16du="http://schemas.microsoft.com/office/word/2023/wordml/word16du" xmlns:w16sdtdh="http://schemas.microsoft.com/office/word/2020/wordml/sdtdatahash" xmlns:w16sdtfl="http://schemas.microsoft.com/office/word/2024/wordml/sdtformatlock" xmlns:w16se="http://schemas.microsoft.com/office/word/2015/wordml/symex" xmlns:wpg="http://schemas.microsoft.com/office/word/2010/wordprocessingGroup" xmlns:wpi="http://schemas.microsoft.com/office/word/2010/wordprocessingInk" xmlns:wne="http://schemas.microsoft.com/office/word/2006/wordml" xmlns:wps="http://schemas.microsoft.com/office/word/2010/wordprocessingShape" mc:Ignorable="w14 w15 w16se w16cid w16 w16cex w16sdtdh w16sdtfl w16du wp14">
+<w:ftr xmlns:wpc="http://schemas.microsoft.com/office/word/2010/wordprocessingCanvas" xmlns:cx="http://schemas.microsoft.com/office/drawing/2014/chartex" xmlns:cx1="http://schemas.microsoft.com/office/drawing/2015/9/8/chartex" xmlns:cx2="http://schemas.microsoft.com/office/drawing/2015/10/21/chartex" xmlns:cx3="http://schemas.microsoft.com/office/drawing/2016/5/9/chartex" xmlns:cx4="http://schemas.microsoft.com/office/drawing/2016/5/10/chartex" xmlns:cx5="http://schemas.microsoft.com/office/drawing/2016/5/11/chartex" xmlns:cx6="http://schemas.microsoft.com/office/drawing/2016/5/12/chartex" xmlns:cx7="http://schemas.microsoft.com/office/drawing/2016/5/13/chartex" xmlns:cx8="http://schemas.microsoft.com/office/drawing/2016/5/14/chartex" xmlns:mc="http://schemas.openxmlformats.org/markup-compatibility/2006" xmlns:aink="http://schemas.microsoft.com/office/drawing/2016/ink" xmlns:am3d="http://schemas.microsoft.com/office/drawing/2017/model3d" xmlns:o="urn:schemas-microsoft-com:office:office" xmlns:r="http://schemas.openxmlformats.org/officeDocument/2006/relationships" xmlns:m="http://schemas.openxmlformats.org/officeDocument/2006/math" xmlns:v="urn:schemas-microsoft-com:vml" xmlns:wp14="http://schemas.microsoft.com/office/word/2010/wordprocessingDrawing" xmlns:wp="http://schemas.openxmlformats.org/drawingml/2006/wordprocessingDrawing" xmlns:w10="urn:schemas-microsoft-com:office:word" xmlns:w="http://schemas.openxmlformats.org/wordprocessingml/2006/main" xmlns:w14="http://schemas.microsoft.com/office/word/2010/wordml" xmlns:w15="http://schemas.microsoft.com/office/word/2012/wordml" xmlns:w16cex="http://schemas.microsoft.com/office/word/2018/wordml/cex" xmlns:w16cid="http://schemas.microsoft.com/office/word/2016/wordml/cid" xmlns:w16="http://schemas.microsoft.com/office/word/2018/wordml" xmlns:w16sdtdh="http://schemas.microsoft.com/office/word/2020/wordml/sdtdatahash" xmlns:w16se="http://schemas.microsoft.com/office/word/2015/wordml/symex" xmlns:wpg="http://schemas.microsoft.com/office/word/2010/wordprocessingGroup" xmlns:wpi="http://schemas.microsoft.com/office/word/2010/wordprocessingInk" xmlns:wne="http://schemas.microsoft.com/office/word/2006/wordml" xmlns:wps="http://schemas.microsoft.com/office/word/2010/wordprocessingShape" mc:Ignorable="w14 w15 w16se w16cid w16 w16cex w16sdtdh wp14">
   <w:p>
     <w:pPr>
       <w:pStyle w:val="Piedepgina"/>
@@ -9626,7 +9854,7 @@
 </file>
 
 <file path=word/footer3.xml><?xml version="1.0" encoding="utf-8"?>
-<w:ftr xmlns:wpc="http://schemas.microsoft.com/office/word/2010/wordprocessingCanvas" xmlns:cx="http://schemas.microsoft.com/office/drawing/2014/chartex" xmlns:cx1="http://schemas.microsoft.com/office/drawing/2015/9/8/chartex" xmlns:cx2="http://schemas.microsoft.com/office/drawing/2015/10/21/chartex" xmlns:cx3="http://schemas.microsoft.com/office/drawing/2016/5/9/chartex" xmlns:cx4="http://schemas.microsoft.com/office/drawing/2016/5/10/chartex" xmlns:cx5="http://schemas.microsoft.com/office/drawing/2016/5/11/chartex" xmlns:cx6="http://schemas.microsoft.com/office/drawing/2016/5/12/chartex" xmlns:cx7="http://schemas.microsoft.com/office/drawing/2016/5/13/chartex" xmlns:cx8="http://schemas.microsoft.com/office/drawing/2016/5/14/chartex" xmlns:mc="http://schemas.openxmlformats.org/markup-compatibility/2006" xmlns:aink="http://schemas.microsoft.com/office/drawing/2016/ink" xmlns:am3d="http://schemas.microsoft.com/office/drawing/2017/model3d" xmlns:o="urn:schemas-microsoft-com:office:office" xmlns:oel="http://schemas.microsoft.com/office/2019/extlst" xmlns:r="http://schemas.openxmlformats.org/officeDocument/2006/relationships" xmlns:m="http://schemas.openxmlformats.org/officeDocument/2006/math" xmlns:v="urn:schemas-microsoft-com:vml" xmlns:wp14="http://schemas.microsoft.com/office/word/2010/wordprocessingDrawing" xmlns:wp="http://schemas.openxmlformats.org/drawingml/2006/wordprocessingDrawing" xmlns:w10="urn:schemas-microsoft-com:office:word" xmlns:w="http://schemas.openxmlformats.org/wordprocessingml/2006/main" xmlns:w14="http://schemas.microsoft.com/office/word/2010/wordml" xmlns:w15="http://schemas.microsoft.com/office/word/2012/wordml" xmlns:w16cex="http://schemas.microsoft.com/office/word/2018/wordml/cex" xmlns:w16cid="http://schemas.microsoft.com/office/word/2016/wordml/cid" xmlns:w16="http://schemas.microsoft.com/office/word/2018/wordml" xmlns:w16du="http://schemas.microsoft.com/office/word/2023/wordml/word16du" xmlns:w16sdtdh="http://schemas.microsoft.com/office/word/2020/wordml/sdtdatahash" xmlns:w16sdtfl="http://schemas.microsoft.com/office/word/2024/wordml/sdtformatlock" xmlns:w16se="http://schemas.microsoft.com/office/word/2015/wordml/symex" xmlns:wpg="http://schemas.microsoft.com/office/word/2010/wordprocessingGroup" xmlns:wpi="http://schemas.microsoft.com/office/word/2010/wordprocessingInk" xmlns:wne="http://schemas.microsoft.com/office/word/2006/wordml" xmlns:wps="http://schemas.microsoft.com/office/word/2010/wordprocessingShape" mc:Ignorable="w14 w15 w16se w16cid w16 w16cex w16sdtdh w16sdtfl w16du wp14">
+<w:ftr xmlns:wpc="http://schemas.microsoft.com/office/word/2010/wordprocessingCanvas" xmlns:cx="http://schemas.microsoft.com/office/drawing/2014/chartex" xmlns:cx1="http://schemas.microsoft.com/office/drawing/2015/9/8/chartex" xmlns:cx2="http://schemas.microsoft.com/office/drawing/2015/10/21/chartex" xmlns:cx3="http://schemas.microsoft.com/office/drawing/2016/5/9/chartex" xmlns:cx4="http://schemas.microsoft.com/office/drawing/2016/5/10/chartex" xmlns:cx5="http://schemas.microsoft.com/office/drawing/2016/5/11/chartex" xmlns:cx6="http://schemas.microsoft.com/office/drawing/2016/5/12/chartex" xmlns:cx7="http://schemas.microsoft.com/office/drawing/2016/5/13/chartex" xmlns:cx8="http://schemas.microsoft.com/office/drawing/2016/5/14/chartex" xmlns:mc="http://schemas.openxmlformats.org/markup-compatibility/2006" xmlns:aink="http://schemas.microsoft.com/office/drawing/2016/ink" xmlns:am3d="http://schemas.microsoft.com/office/drawing/2017/model3d" xmlns:o="urn:schemas-microsoft-com:office:office" xmlns:r="http://schemas.openxmlformats.org/officeDocument/2006/relationships" xmlns:m="http://schemas.openxmlformats.org/officeDocument/2006/math" xmlns:v="urn:schemas-microsoft-com:vml" xmlns:wp14="http://schemas.microsoft.com/office/word/2010/wordprocessingDrawing" xmlns:wp="http://schemas.openxmlformats.org/drawingml/2006/wordprocessingDrawing" xmlns:w10="urn:schemas-microsoft-com:office:word" xmlns:w="http://schemas.openxmlformats.org/wordprocessingml/2006/main" xmlns:w14="http://schemas.microsoft.com/office/word/2010/wordml" xmlns:w15="http://schemas.microsoft.com/office/word/2012/wordml" xmlns:w16cex="http://schemas.microsoft.com/office/word/2018/wordml/cex" xmlns:w16cid="http://schemas.microsoft.com/office/word/2016/wordml/cid" xmlns:w16="http://schemas.microsoft.com/office/word/2018/wordml" xmlns:w16sdtdh="http://schemas.microsoft.com/office/word/2020/wordml/sdtdatahash" xmlns:w16se="http://schemas.microsoft.com/office/word/2015/wordml/symex" xmlns:wpg="http://schemas.microsoft.com/office/word/2010/wordprocessingGroup" xmlns:wpi="http://schemas.microsoft.com/office/word/2010/wordprocessingInk" xmlns:wne="http://schemas.microsoft.com/office/word/2006/wordml" xmlns:wps="http://schemas.microsoft.com/office/word/2010/wordprocessingShape" mc:Ignorable="w14 w15 w16se w16cid w16 w16cex w16sdtdh wp14">
   <w:p>
     <w:pPr>
       <w:pStyle w:val="Piedepgina"/>
@@ -9636,7 +9864,7 @@
 </file>
 
 <file path=word/footnotes.xml><?xml version="1.0" encoding="utf-8"?>
-<w:footnotes xmlns:wpc="http://schemas.microsoft.com/office/word/2010/wordprocessingCanvas" xmlns:cx="http://schemas.microsoft.com/office/drawing/2014/chartex" xmlns:cx1="http://schemas.microsoft.com/office/drawing/2015/9/8/chartex" xmlns:cx2="http://schemas.microsoft.com/office/drawing/2015/10/21/chartex" xmlns:cx3="http://schemas.microsoft.com/office/drawing/2016/5/9/chartex" xmlns:cx4="http://schemas.microsoft.com/office/drawing/2016/5/10/chartex" xmlns:cx5="http://schemas.microsoft.com/office/drawing/2016/5/11/chartex" xmlns:cx6="http://schemas.microsoft.com/office/drawing/2016/5/12/chartex" xmlns:cx7="http://schemas.microsoft.com/office/drawing/2016/5/13/chartex" xmlns:cx8="http://schemas.microsoft.com/office/drawing/2016/5/14/chartex" xmlns:mc="http://schemas.openxmlformats.org/markup-compatibility/2006" xmlns:aink="http://schemas.microsoft.com/office/drawing/2016/ink" xmlns:am3d="http://schemas.microsoft.com/office/drawing/2017/model3d" xmlns:o="urn:schemas-microsoft-com:office:office" xmlns:oel="http://schemas.microsoft.com/office/2019/extlst" xmlns:r="http://schemas.openxmlformats.org/officeDocument/2006/relationships" xmlns:m="http://schemas.openxmlformats.org/officeDocument/2006/math" xmlns:v="urn:schemas-microsoft-com:vml" xmlns:wp14="http://schemas.microsoft.com/office/word/2010/wordprocessingDrawing" xmlns:wp="http://schemas.openxmlformats.org/drawingml/2006/wordprocessingDrawing" xmlns:w10="urn:schemas-microsoft-com:office:word" xmlns:w="http://schemas.openxmlformats.org/wordprocessingml/2006/main" xmlns:w14="http://schemas.microsoft.com/office/word/2010/wordml" xmlns:w15="http://schemas.microsoft.com/office/word/2012/wordml" xmlns:w16cex="http://schemas.microsoft.com/office/word/2018/wordml/cex" xmlns:w16cid="http://schemas.microsoft.com/office/word/2016/wordml/cid" xmlns:w16="http://schemas.microsoft.com/office/word/2018/wordml" xmlns:w16du="http://schemas.microsoft.com/office/word/2023/wordml/word16du" xmlns:w16sdtdh="http://schemas.microsoft.com/office/word/2020/wordml/sdtdatahash" xmlns:w16sdtfl="http://schemas.microsoft.com/office/word/2024/wordml/sdtformatlock" xmlns:w16se="http://schemas.microsoft.com/office/word/2015/wordml/symex" xmlns:wpg="http://schemas.microsoft.com/office/word/2010/wordprocessingGroup" xmlns:wpi="http://schemas.microsoft.com/office/word/2010/wordprocessingInk" xmlns:wne="http://schemas.microsoft.com/office/word/2006/wordml" xmlns:wps="http://schemas.microsoft.com/office/word/2010/wordprocessingShape" mc:Ignorable="w14 w15 w16se w16cid w16 w16cex w16sdtdh w16sdtfl w16du wp14">
+<w:footnotes xmlns:wpc="http://schemas.microsoft.com/office/word/2010/wordprocessingCanvas" xmlns:cx="http://schemas.microsoft.com/office/drawing/2014/chartex" xmlns:cx1="http://schemas.microsoft.com/office/drawing/2015/9/8/chartex" xmlns:cx2="http://schemas.microsoft.com/office/drawing/2015/10/21/chartex" xmlns:cx3="http://schemas.microsoft.com/office/drawing/2016/5/9/chartex" xmlns:cx4="http://schemas.microsoft.com/office/drawing/2016/5/10/chartex" xmlns:cx5="http://schemas.microsoft.com/office/drawing/2016/5/11/chartex" xmlns:cx6="http://schemas.microsoft.com/office/drawing/2016/5/12/chartex" xmlns:cx7="http://schemas.microsoft.com/office/drawing/2016/5/13/chartex" xmlns:cx8="http://schemas.microsoft.com/office/drawing/2016/5/14/chartex" xmlns:mc="http://schemas.openxmlformats.org/markup-compatibility/2006" xmlns:aink="http://schemas.microsoft.com/office/drawing/2016/ink" xmlns:am3d="http://schemas.microsoft.com/office/drawing/2017/model3d" xmlns:o="urn:schemas-microsoft-com:office:office" xmlns:r="http://schemas.openxmlformats.org/officeDocument/2006/relationships" xmlns:m="http://schemas.openxmlformats.org/officeDocument/2006/math" xmlns:v="urn:schemas-microsoft-com:vml" xmlns:wp14="http://schemas.microsoft.com/office/word/2010/wordprocessingDrawing" xmlns:wp="http://schemas.openxmlformats.org/drawingml/2006/wordprocessingDrawing" xmlns:w10="urn:schemas-microsoft-com:office:word" xmlns:w="http://schemas.openxmlformats.org/wordprocessingml/2006/main" xmlns:w14="http://schemas.microsoft.com/office/word/2010/wordml" xmlns:w15="http://schemas.microsoft.com/office/word/2012/wordml" xmlns:w16cex="http://schemas.microsoft.com/office/word/2018/wordml/cex" xmlns:w16cid="http://schemas.microsoft.com/office/word/2016/wordml/cid" xmlns:w16="http://schemas.microsoft.com/office/word/2018/wordml" xmlns:w16sdtdh="http://schemas.microsoft.com/office/word/2020/wordml/sdtdatahash" xmlns:w16se="http://schemas.microsoft.com/office/word/2015/wordml/symex" xmlns:wpg="http://schemas.microsoft.com/office/word/2010/wordprocessingGroup" xmlns:wpi="http://schemas.microsoft.com/office/word/2010/wordprocessingInk" xmlns:wne="http://schemas.microsoft.com/office/word/2006/wordml" xmlns:wps="http://schemas.microsoft.com/office/word/2010/wordprocessingShape" mc:Ignorable="w14 w15 w16se w16cid w16 w16cex w16sdtdh wp14">
   <w:footnote w:type="separator" w:id="-1">
     <w:p>
       <w:pPr>
@@ -9661,7 +9889,7 @@
 </file>
 
 <file path=word/header1.xml><?xml version="1.0" encoding="utf-8"?>
-<w:hdr xmlns:wpc="http://schemas.microsoft.com/office/word/2010/wordprocessingCanvas" xmlns:cx="http://schemas.microsoft.com/office/drawing/2014/chartex" xmlns:cx1="http://schemas.microsoft.com/office/drawing/2015/9/8/chartex" xmlns:cx2="http://schemas.microsoft.com/office/drawing/2015/10/21/chartex" xmlns:cx3="http://schemas.microsoft.com/office/drawing/2016/5/9/chartex" xmlns:cx4="http://schemas.microsoft.com/office/drawing/2016/5/10/chartex" xmlns:cx5="http://schemas.microsoft.com/office/drawing/2016/5/11/chartex" xmlns:cx6="http://schemas.microsoft.com/office/drawing/2016/5/12/chartex" xmlns:cx7="http://schemas.microsoft.com/office/drawing/2016/5/13/chartex" xmlns:cx8="http://schemas.microsoft.com/office/drawing/2016/5/14/chartex" xmlns:mc="http://schemas.openxmlformats.org/markup-compatibility/2006" xmlns:aink="http://schemas.microsoft.com/office/drawing/2016/ink" xmlns:am3d="http://schemas.microsoft.com/office/drawing/2017/model3d" xmlns:o="urn:schemas-microsoft-com:office:office" xmlns:oel="http://schemas.microsoft.com/office/2019/extlst" xmlns:r="http://schemas.openxmlformats.org/officeDocument/2006/relationships" xmlns:m="http://schemas.openxmlformats.org/officeDocument/2006/math" xmlns:v="urn:schemas-microsoft-com:vml" xmlns:wp14="http://schemas.microsoft.com/office/word/2010/wordprocessingDrawing" xmlns:wp="http://schemas.openxmlformats.org/drawingml/2006/wordprocessingDrawing" xmlns:w10="urn:schemas-microsoft-com:office:word" xmlns:w="http://schemas.openxmlformats.org/wordprocessingml/2006/main" xmlns:w14="http://schemas.microsoft.com/office/word/2010/wordml" xmlns:w15="http://schemas.microsoft.com/office/word/2012/wordml" xmlns:w16cex="http://schemas.microsoft.com/office/word/2018/wordml/cex" xmlns:w16cid="http://schemas.microsoft.com/office/word/2016/wordml/cid" xmlns:w16="http://schemas.microsoft.com/office/word/2018/wordml" xmlns:w16du="http://schemas.microsoft.com/office/word/2023/wordml/word16du" xmlns:w16sdtdh="http://schemas.microsoft.com/office/word/2020/wordml/sdtdatahash" xmlns:w16sdtfl="http://schemas.microsoft.com/office/word/2024/wordml/sdtformatlock" xmlns:w16se="http://schemas.microsoft.com/office/word/2015/wordml/symex" xmlns:wpg="http://schemas.microsoft.com/office/word/2010/wordprocessingGroup" xmlns:wpi="http://schemas.microsoft.com/office/word/2010/wordprocessingInk" xmlns:wne="http://schemas.microsoft.com/office/word/2006/wordml" xmlns:wps="http://schemas.microsoft.com/office/word/2010/wordprocessingShape" mc:Ignorable="w14 w15 w16se w16cid w16 w16cex w16sdtdh w16sdtfl w16du wp14">
+<w:hdr xmlns:wpc="http://schemas.microsoft.com/office/word/2010/wordprocessingCanvas" xmlns:cx="http://schemas.microsoft.com/office/drawing/2014/chartex" xmlns:cx1="http://schemas.microsoft.com/office/drawing/2015/9/8/chartex" xmlns:cx2="http://schemas.microsoft.com/office/drawing/2015/10/21/chartex" xmlns:cx3="http://schemas.microsoft.com/office/drawing/2016/5/9/chartex" xmlns:cx4="http://schemas.microsoft.com/office/drawing/2016/5/10/chartex" xmlns:cx5="http://schemas.microsoft.com/office/drawing/2016/5/11/chartex" xmlns:cx6="http://schemas.microsoft.com/office/drawing/2016/5/12/chartex" xmlns:cx7="http://schemas.microsoft.com/office/drawing/2016/5/13/chartex" xmlns:cx8="http://schemas.microsoft.com/office/drawing/2016/5/14/chartex" xmlns:mc="http://schemas.openxmlformats.org/markup-compatibility/2006" xmlns:aink="http://schemas.microsoft.com/office/drawing/2016/ink" xmlns:am3d="http://schemas.microsoft.com/office/drawing/2017/model3d" xmlns:o="urn:schemas-microsoft-com:office:office" xmlns:r="http://schemas.openxmlformats.org/officeDocument/2006/relationships" xmlns:m="http://schemas.openxmlformats.org/officeDocument/2006/math" xmlns:v="urn:schemas-microsoft-com:vml" xmlns:wp14="http://schemas.microsoft.com/office/word/2010/wordprocessingDrawing" xmlns:wp="http://schemas.openxmlformats.org/drawingml/2006/wordprocessingDrawing" xmlns:w10="urn:schemas-microsoft-com:office:word" xmlns:w="http://schemas.openxmlformats.org/wordprocessingml/2006/main" xmlns:w14="http://schemas.microsoft.com/office/word/2010/wordml" xmlns:w15="http://schemas.microsoft.com/office/word/2012/wordml" xmlns:w16cex="http://schemas.microsoft.com/office/word/2018/wordml/cex" xmlns:w16cid="http://schemas.microsoft.com/office/word/2016/wordml/cid" xmlns:w16="http://schemas.microsoft.com/office/word/2018/wordml" xmlns:w16sdtdh="http://schemas.microsoft.com/office/word/2020/wordml/sdtdatahash" xmlns:w16se="http://schemas.microsoft.com/office/word/2015/wordml/symex" xmlns:wpg="http://schemas.microsoft.com/office/word/2010/wordprocessingGroup" xmlns:wpi="http://schemas.microsoft.com/office/word/2010/wordprocessingInk" xmlns:wne="http://schemas.microsoft.com/office/word/2006/wordml" xmlns:wps="http://schemas.microsoft.com/office/word/2010/wordprocessingShape" mc:Ignorable="w14 w15 w16se w16cid w16 w16cex w16sdtdh wp14">
   <w:p>
     <w:pPr>
       <w:pStyle w:val="Encabezado"/>
@@ -9671,7 +9899,7 @@
 </file>
 
 <file path=word/header2.xml><?xml version="1.0" encoding="utf-8"?>
-<w:hdr xmlns:wpc="http://schemas.microsoft.com/office/word/2010/wordprocessingCanvas" xmlns:cx="http://schemas.microsoft.com/office/drawing/2014/chartex" xmlns:cx1="http://schemas.microsoft.com/office/drawing/2015/9/8/chartex" xmlns:cx2="http://schemas.microsoft.com/office/drawing/2015/10/21/chartex" xmlns:cx3="http://schemas.microsoft.com/office/drawing/2016/5/9/chartex" xmlns:cx4="http://schemas.microsoft.com/office/drawing/2016/5/10/chartex" xmlns:cx5="http://schemas.microsoft.com/office/drawing/2016/5/11/chartex" xmlns:cx6="http://schemas.microsoft.com/office/drawing/2016/5/12/chartex" xmlns:cx7="http://schemas.microsoft.com/office/drawing/2016/5/13/chartex" xmlns:cx8="http://schemas.microsoft.com/office/drawing/2016/5/14/chartex" xmlns:mc="http://schemas.openxmlformats.org/markup-compatibility/2006" xmlns:aink="http://schemas.microsoft.com/office/drawing/2016/ink" xmlns:am3d="http://schemas.microsoft.com/office/drawing/2017/model3d" xmlns:o="urn:schemas-microsoft-com:office:office" xmlns:oel="http://schemas.microsoft.com/office/2019/extlst" xmlns:r="http://schemas.openxmlformats.org/officeDocument/2006/relationships" xmlns:m="http://schemas.openxmlformats.org/officeDocument/2006/math" xmlns:v="urn:schemas-microsoft-com:vml" xmlns:wp14="http://schemas.microsoft.com/office/word/2010/wordprocessingDrawing" xmlns:wp="http://schemas.openxmlformats.org/drawingml/2006/wordprocessingDrawing" xmlns:w10="urn:schemas-microsoft-com:office:word" xmlns:w="http://schemas.openxmlformats.org/wordprocessingml/2006/main" xmlns:w14="http://schemas.microsoft.com/office/word/2010/wordml" xmlns:w15="http://schemas.microsoft.com/office/word/2012/wordml" xmlns:w16cex="http://schemas.microsoft.com/office/word/2018/wordml/cex" xmlns:w16cid="http://schemas.microsoft.com/office/word/2016/wordml/cid" xmlns:w16="http://schemas.microsoft.com/office/word/2018/wordml" xmlns:w16du="http://schemas.microsoft.com/office/word/2023/wordml/word16du" xmlns:w16sdtdh="http://schemas.microsoft.com/office/word/2020/wordml/sdtdatahash" xmlns:w16sdtfl="http://schemas.microsoft.com/office/word/2024/wordml/sdtformatlock" xmlns:w16se="http://schemas.microsoft.com/office/word/2015/wordml/symex" xmlns:wpg="http://schemas.microsoft.com/office/word/2010/wordprocessingGroup" xmlns:wpi="http://schemas.microsoft.com/office/word/2010/wordprocessingInk" xmlns:wne="http://schemas.microsoft.com/office/word/2006/wordml" xmlns:wps="http://schemas.microsoft.com/office/word/2010/wordprocessingShape" mc:Ignorable="w14 w15 w16se w16cid w16 w16cex w16sdtdh w16sdtfl w16du wp14">
+<w:hdr xmlns:wpc="http://schemas.microsoft.com/office/word/2010/wordprocessingCanvas" xmlns:cx="http://schemas.microsoft.com/office/drawing/2014/chartex" xmlns:cx1="http://schemas.microsoft.com/office/drawing/2015/9/8/chartex" xmlns:cx2="http://schemas.microsoft.com/office/drawing/2015/10/21/chartex" xmlns:cx3="http://schemas.microsoft.com/office/drawing/2016/5/9/chartex" xmlns:cx4="http://schemas.microsoft.com/office/drawing/2016/5/10/chartex" xmlns:cx5="http://schemas.microsoft.com/office/drawing/2016/5/11/chartex" xmlns:cx6="http://schemas.microsoft.com/office/drawing/2016/5/12/chartex" xmlns:cx7="http://schemas.microsoft.com/office/drawing/2016/5/13/chartex" xmlns:cx8="http://schemas.microsoft.com/office/drawing/2016/5/14/chartex" xmlns:mc="http://schemas.openxmlformats.org/markup-compatibility/2006" xmlns:aink="http://schemas.microsoft.com/office/drawing/2016/ink" xmlns:am3d="http://schemas.microsoft.com/office/drawing/2017/model3d" xmlns:o="urn:schemas-microsoft-com:office:office" xmlns:r="http://schemas.openxmlformats.org/officeDocument/2006/relationships" xmlns:m="http://schemas.openxmlformats.org/officeDocument/2006/math" xmlns:v="urn:schemas-microsoft-com:vml" xmlns:wp14="http://schemas.microsoft.com/office/word/2010/wordprocessingDrawing" xmlns:wp="http://schemas.openxmlformats.org/drawingml/2006/wordprocessingDrawing" xmlns:w10="urn:schemas-microsoft-com:office:word" xmlns:w="http://schemas.openxmlformats.org/wordprocessingml/2006/main" xmlns:w14="http://schemas.microsoft.com/office/word/2010/wordml" xmlns:w15="http://schemas.microsoft.com/office/word/2012/wordml" xmlns:w16cex="http://schemas.microsoft.com/office/word/2018/wordml/cex" xmlns:w16cid="http://schemas.microsoft.com/office/word/2016/wordml/cid" xmlns:w16="http://schemas.microsoft.com/office/word/2018/wordml" xmlns:w16sdtdh="http://schemas.microsoft.com/office/word/2020/wordml/sdtdatahash" xmlns:w16se="http://schemas.microsoft.com/office/word/2015/wordml/symex" xmlns:wpg="http://schemas.microsoft.com/office/word/2010/wordprocessingGroup" xmlns:wpi="http://schemas.microsoft.com/office/word/2010/wordprocessingInk" xmlns:wne="http://schemas.microsoft.com/office/word/2006/wordml" xmlns:wps="http://schemas.microsoft.com/office/word/2010/wordprocessingShape" mc:Ignorable="w14 w15 w16se w16cid w16 w16cex w16sdtdh wp14">
   <w:tbl>
     <w:tblPr>
       <w:tblW w:w="0" w:type="auto"/>
@@ -9708,7 +9936,7 @@
 </file>
 
 <file path=word/header3.xml><?xml version="1.0" encoding="utf-8"?>
-<w:hdr xmlns:wpc="http://schemas.microsoft.com/office/word/2010/wordprocessingCanvas" xmlns:cx="http://schemas.microsoft.com/office/drawing/2014/chartex" xmlns:cx1="http://schemas.microsoft.com/office/drawing/2015/9/8/chartex" xmlns:cx2="http://schemas.microsoft.com/office/drawing/2015/10/21/chartex" xmlns:cx3="http://schemas.microsoft.com/office/drawing/2016/5/9/chartex" xmlns:cx4="http://schemas.microsoft.com/office/drawing/2016/5/10/chartex" xmlns:cx5="http://schemas.microsoft.com/office/drawing/2016/5/11/chartex" xmlns:cx6="http://schemas.microsoft.com/office/drawing/2016/5/12/chartex" xmlns:cx7="http://schemas.microsoft.com/office/drawing/2016/5/13/chartex" xmlns:cx8="http://schemas.microsoft.com/office/drawing/2016/5/14/chartex" xmlns:mc="http://schemas.openxmlformats.org/markup-compatibility/2006" xmlns:aink="http://schemas.microsoft.com/office/drawing/2016/ink" xmlns:am3d="http://schemas.microsoft.com/office/drawing/2017/model3d" xmlns:o="urn:schemas-microsoft-com:office:office" xmlns:oel="http://schemas.microsoft.com/office/2019/extlst" xmlns:r="http://schemas.openxmlformats.org/officeDocument/2006/relationships" xmlns:m="http://schemas.openxmlformats.org/officeDocument/2006/math" xmlns:v="urn:schemas-microsoft-com:vml" xmlns:wp14="http://schemas.microsoft.com/office/word/2010/wordprocessingDrawing" xmlns:wp="http://schemas.openxmlformats.org/drawingml/2006/wordprocessingDrawing" xmlns:w10="urn:schemas-microsoft-com:office:word" xmlns:w="http://schemas.openxmlformats.org/wordprocessingml/2006/main" xmlns:w14="http://schemas.microsoft.com/office/word/2010/wordml" xmlns:w15="http://schemas.microsoft.com/office/word/2012/wordml" xmlns:w16cex="http://schemas.microsoft.com/office/word/2018/wordml/cex" xmlns:w16cid="http://schemas.microsoft.com/office/word/2016/wordml/cid" xmlns:w16="http://schemas.microsoft.com/office/word/2018/wordml" xmlns:w16du="http://schemas.microsoft.com/office/word/2023/wordml/word16du" xmlns:w16sdtdh="http://schemas.microsoft.com/office/word/2020/wordml/sdtdatahash" xmlns:w16sdtfl="http://schemas.microsoft.com/office/word/2024/wordml/sdtformatlock" xmlns:w16se="http://schemas.microsoft.com/office/word/2015/wordml/symex" xmlns:wpg="http://schemas.microsoft.com/office/word/2010/wordprocessingGroup" xmlns:wpi="http://schemas.microsoft.com/office/word/2010/wordprocessingInk" xmlns:wne="http://schemas.microsoft.com/office/word/2006/wordml" xmlns:wps="http://schemas.microsoft.com/office/word/2010/wordprocessingShape" mc:Ignorable="w14 w15 w16se w16cid w16 w16cex w16sdtdh w16sdtfl w16du wp14">
+<w:hdr xmlns:wpc="http://schemas.microsoft.com/office/word/2010/wordprocessingCanvas" xmlns:cx="http://schemas.microsoft.com/office/drawing/2014/chartex" xmlns:cx1="http://schemas.microsoft.com/office/drawing/2015/9/8/chartex" xmlns:cx2="http://schemas.microsoft.com/office/drawing/2015/10/21/chartex" xmlns:cx3="http://schemas.microsoft.com/office/drawing/2016/5/9/chartex" xmlns:cx4="http://schemas.microsoft.com/office/drawing/2016/5/10/chartex" xmlns:cx5="http://schemas.microsoft.com/office/drawing/2016/5/11/chartex" xmlns:cx6="http://schemas.microsoft.com/office/drawing/2016/5/12/chartex" xmlns:cx7="http://schemas.microsoft.com/office/drawing/2016/5/13/chartex" xmlns:cx8="http://schemas.microsoft.com/office/drawing/2016/5/14/chartex" xmlns:mc="http://schemas.openxmlformats.org/markup-compatibility/2006" xmlns:aink="http://schemas.microsoft.com/office/drawing/2016/ink" xmlns:am3d="http://schemas.microsoft.com/office/drawing/2017/model3d" xmlns:o="urn:schemas-microsoft-com:office:office" xmlns:r="http://schemas.openxmlformats.org/officeDocument/2006/relationships" xmlns:m="http://schemas.openxmlformats.org/officeDocument/2006/math" xmlns:v="urn:schemas-microsoft-com:vml" xmlns:wp14="http://schemas.microsoft.com/office/word/2010/wordprocessingDrawing" xmlns:wp="http://schemas.openxmlformats.org/drawingml/2006/wordprocessingDrawing" xmlns:w10="urn:schemas-microsoft-com:office:word" xmlns:w="http://schemas.openxmlformats.org/wordprocessingml/2006/main" xmlns:w14="http://schemas.microsoft.com/office/word/2010/wordml" xmlns:w15="http://schemas.microsoft.com/office/word/2012/wordml" xmlns:w16cex="http://schemas.microsoft.com/office/word/2018/wordml/cex" xmlns:w16cid="http://schemas.microsoft.com/office/word/2016/wordml/cid" xmlns:w16="http://schemas.microsoft.com/office/word/2018/wordml" xmlns:w16sdtdh="http://schemas.microsoft.com/office/word/2020/wordml/sdtdatahash" xmlns:w16se="http://schemas.microsoft.com/office/word/2015/wordml/symex" xmlns:wpg="http://schemas.microsoft.com/office/word/2010/wordprocessingGroup" xmlns:wpi="http://schemas.microsoft.com/office/word/2010/wordprocessingInk" xmlns:wne="http://schemas.microsoft.com/office/word/2006/wordml" xmlns:wps="http://schemas.microsoft.com/office/word/2010/wordprocessingShape" mc:Ignorable="w14 w15 w16se w16cid w16 w16cex w16sdtdh wp14">
   <w:p>
     <w:pPr>
       <w:pStyle w:val="Encabezado"/>
@@ -9718,7 +9946,7 @@
 </file>
 
 <file path=word/numbering.xml><?xml version="1.0" encoding="utf-8"?>
-<w:numbering xmlns:wpc="http://schemas.microsoft.com/office/word/2010/wordprocessingCanvas" xmlns:cx="http://schemas.microsoft.com/office/drawing/2014/chartex" xmlns:cx1="http://schemas.microsoft.com/office/drawing/2015/9/8/chartex" xmlns:cx2="http://schemas.microsoft.com/office/drawing/2015/10/21/chartex" xmlns:cx3="http://schemas.microsoft.com/office/drawing/2016/5/9/chartex" xmlns:cx4="http://schemas.microsoft.com/office/drawing/2016/5/10/chartex" xmlns:cx5="http://schemas.microsoft.com/office/drawing/2016/5/11/chartex" xmlns:cx6="http://schemas.microsoft.com/office/drawing/2016/5/12/chartex" xmlns:cx7="http://schemas.microsoft.com/office/drawing/2016/5/13/chartex" xmlns:cx8="http://schemas.microsoft.com/office/drawing/2016/5/14/chartex" xmlns:mc="http://schemas.openxmlformats.org/markup-compatibility/2006" xmlns:aink="http://schemas.microsoft.com/office/drawing/2016/ink" xmlns:am3d="http://schemas.microsoft.com/office/drawing/2017/model3d" xmlns:o="urn:schemas-microsoft-com:office:office" xmlns:oel="http://schemas.microsoft.com/office/2019/extlst" xmlns:r="http://schemas.openxmlformats.org/officeDocument/2006/relationships" xmlns:m="http://schemas.openxmlformats.org/officeDocument/2006/math" xmlns:v="urn:schemas-microsoft-com:vml" xmlns:wp14="http://schemas.microsoft.com/office/word/2010/wordprocessingDrawing" xmlns:wp="http://schemas.openxmlformats.org/drawingml/2006/wordprocessingDrawing" xmlns:w10="urn:schemas-microsoft-com:office:word" xmlns:w="http://schemas.openxmlformats.org/wordprocessingml/2006/main" xmlns:w14="http://schemas.microsoft.com/office/word/2010/wordml" xmlns:w15="http://schemas.microsoft.com/office/word/2012/wordml" xmlns:w16cex="http://schemas.microsoft.com/office/word/2018/wordml/cex" xmlns:w16cid="http://schemas.microsoft.com/office/word/2016/wordml/cid" xmlns:w16="http://schemas.microsoft.com/office/word/2018/wordml" xmlns:w16du="http://schemas.microsoft.com/office/word/2023/wordml/word16du" xmlns:w16sdtdh="http://schemas.microsoft.com/office/word/2020/wordml/sdtdatahash" xmlns:w16sdtfl="http://schemas.microsoft.com/office/word/2024/wordml/sdtformatlock" xmlns:w16se="http://schemas.microsoft.com/office/word/2015/wordml/symex" xmlns:wpg="http://schemas.microsoft.com/office/word/2010/wordprocessingGroup" xmlns:wpi="http://schemas.microsoft.com/office/word/2010/wordprocessingInk" xmlns:wne="http://schemas.microsoft.com/office/word/2006/wordml" xmlns:wps="http://schemas.microsoft.com/office/word/2010/wordprocessingShape" mc:Ignorable="w14 w15 w16se w16cid w16 w16cex w16sdtdh w16sdtfl w16du wp14">
+<w:numbering xmlns:wpc="http://schemas.microsoft.com/office/word/2010/wordprocessingCanvas" xmlns:cx="http://schemas.microsoft.com/office/drawing/2014/chartex" xmlns:cx1="http://schemas.microsoft.com/office/drawing/2015/9/8/chartex" xmlns:cx2="http://schemas.microsoft.com/office/drawing/2015/10/21/chartex" xmlns:cx3="http://schemas.microsoft.com/office/drawing/2016/5/9/chartex" xmlns:cx4="http://schemas.microsoft.com/office/drawing/2016/5/10/chartex" xmlns:cx5="http://schemas.microsoft.com/office/drawing/2016/5/11/chartex" xmlns:cx6="http://schemas.microsoft.com/office/drawing/2016/5/12/chartex" xmlns:cx7="http://schemas.microsoft.com/office/drawing/2016/5/13/chartex" xmlns:cx8="http://schemas.microsoft.com/office/drawing/2016/5/14/chartex" xmlns:mc="http://schemas.openxmlformats.org/markup-compatibility/2006" xmlns:aink="http://schemas.microsoft.com/office/drawing/2016/ink" xmlns:am3d="http://schemas.microsoft.com/office/drawing/2017/model3d" xmlns:o="urn:schemas-microsoft-com:office:office" xmlns:r="http://schemas.openxmlformats.org/officeDocument/2006/relationships" xmlns:m="http://schemas.openxmlformats.org/officeDocument/2006/math" xmlns:v="urn:schemas-microsoft-com:vml" xmlns:wp14="http://schemas.microsoft.com/office/word/2010/wordprocessingDrawing" xmlns:wp="http://schemas.openxmlformats.org/drawingml/2006/wordprocessingDrawing" xmlns:w10="urn:schemas-microsoft-com:office:word" xmlns:w="http://schemas.openxmlformats.org/wordprocessingml/2006/main" xmlns:w14="http://schemas.microsoft.com/office/word/2010/wordml" xmlns:w15="http://schemas.microsoft.com/office/word/2012/wordml" xmlns:w16cex="http://schemas.microsoft.com/office/word/2018/wordml/cex" xmlns:w16cid="http://schemas.microsoft.com/office/word/2016/wordml/cid" xmlns:w16="http://schemas.microsoft.com/office/word/2018/wordml" xmlns:w16sdtdh="http://schemas.microsoft.com/office/word/2020/wordml/sdtdatahash" xmlns:w16se="http://schemas.microsoft.com/office/word/2015/wordml/symex" xmlns:wpg="http://schemas.microsoft.com/office/word/2010/wordprocessingGroup" xmlns:wpi="http://schemas.microsoft.com/office/word/2010/wordprocessingInk" xmlns:wne="http://schemas.microsoft.com/office/word/2006/wordml" xmlns:wps="http://schemas.microsoft.com/office/word/2010/wordprocessingShape" mc:Ignorable="w14 w15 w16se w16cid w16 w16cex w16sdtdh wp14">
   <w:abstractNum w:abstractNumId="0" w15:restartNumberingAfterBreak="0">
     <w:nsid w:val="014D040F"/>
     <w:multiLevelType w:val="hybridMultilevel"/>
@@ -10807,37 +11035,37 @@
       </w:rPr>
     </w:lvl>
   </w:abstractNum>
-  <w:num w:numId="1" w16cid:durableId="152455739">
+  <w:num w:numId="1">
     <w:abstractNumId w:val="5"/>
   </w:num>
-  <w:num w:numId="2" w16cid:durableId="1315329655">
+  <w:num w:numId="2">
     <w:abstractNumId w:val="6"/>
   </w:num>
-  <w:num w:numId="3" w16cid:durableId="1657414992">
+  <w:num w:numId="3">
     <w:abstractNumId w:val="8"/>
   </w:num>
-  <w:num w:numId="4" w16cid:durableId="780806981">
+  <w:num w:numId="4">
     <w:abstractNumId w:val="0"/>
   </w:num>
-  <w:num w:numId="5" w16cid:durableId="333150682">
+  <w:num w:numId="5">
     <w:abstractNumId w:val="2"/>
   </w:num>
-  <w:num w:numId="6" w16cid:durableId="132716367">
+  <w:num w:numId="6">
     <w:abstractNumId w:val="1"/>
   </w:num>
-  <w:num w:numId="7" w16cid:durableId="504780746">
+  <w:num w:numId="7">
     <w:abstractNumId w:val="4"/>
   </w:num>
-  <w:num w:numId="8" w16cid:durableId="1850637507">
+  <w:num w:numId="8">
     <w:abstractNumId w:val="3"/>
   </w:num>
-  <w:num w:numId="9" w16cid:durableId="287055245">
+  <w:num w:numId="9">
     <w:abstractNumId w:val="9"/>
   </w:num>
-  <w:num w:numId="10" w16cid:durableId="1170876123">
+  <w:num w:numId="10">
     <w:abstractNumId w:val="7"/>
   </w:num>
-  <w:num w:numId="11" w16cid:durableId="1882088266">
+  <w:num w:numId="11">
     <w:abstractNumId w:val="7"/>
     <w:lvlOverride w:ilvl="0">
       <w:startOverride w:val="1"/>
@@ -10872,7 +11100,7 @@
 </file>
 
 <file path=word/styles.xml><?xml version="1.0" encoding="utf-8"?>
-<w:styles xmlns:mc="http://schemas.openxmlformats.org/markup-compatibility/2006" xmlns:r="http://schemas.openxmlformats.org/officeDocument/2006/relationships" xmlns:w="http://schemas.openxmlformats.org/wordprocessingml/2006/main" xmlns:w14="http://schemas.microsoft.com/office/word/2010/wordml" xmlns:w15="http://schemas.microsoft.com/office/word/2012/wordml" xmlns:w16cex="http://schemas.microsoft.com/office/word/2018/wordml/cex" xmlns:w16cid="http://schemas.microsoft.com/office/word/2016/wordml/cid" xmlns:w16="http://schemas.microsoft.com/office/word/2018/wordml" xmlns:w16du="http://schemas.microsoft.com/office/word/2023/wordml/word16du" xmlns:w16sdtdh="http://schemas.microsoft.com/office/word/2020/wordml/sdtdatahash" xmlns:w16sdtfl="http://schemas.microsoft.com/office/word/2024/wordml/sdtformatlock" xmlns:w16se="http://schemas.microsoft.com/office/word/2015/wordml/symex" mc:Ignorable="w14 w15 w16se w16cid w16 w16cex w16sdtdh w16sdtfl w16du">
+<w:styles xmlns:mc="http://schemas.openxmlformats.org/markup-compatibility/2006" xmlns:r="http://schemas.openxmlformats.org/officeDocument/2006/relationships" xmlns:w="http://schemas.openxmlformats.org/wordprocessingml/2006/main" xmlns:w14="http://schemas.microsoft.com/office/word/2010/wordml" xmlns:w15="http://schemas.microsoft.com/office/word/2012/wordml" xmlns:w16cex="http://schemas.microsoft.com/office/word/2018/wordml/cex" xmlns:w16cid="http://schemas.microsoft.com/office/word/2016/wordml/cid" xmlns:w16="http://schemas.microsoft.com/office/word/2018/wordml" xmlns:w16sdtdh="http://schemas.microsoft.com/office/word/2020/wordml/sdtdatahash" xmlns:w16se="http://schemas.microsoft.com/office/word/2015/wordml/symex" mc:Ignorable="w14 w15 w16se w16cid w16 w16cex w16sdtdh">
   <w:docDefaults>
     <w:rPrDefault>
       <w:rPr>
@@ -12238,17 +12466,19 @@
 </file>
 
 <file path=customXml/item1.xml><?xml version="1.0" encoding="utf-8"?>
-<p:properties xmlns:p="http://schemas.microsoft.com/office/2006/metadata/properties" xmlns:xsi="http://www.w3.org/2001/XMLSchema-instance" xmlns:pc="http://schemas.microsoft.com/office/infopath/2007/PartnerControls">
-  <documentManagement>
-    <TaxCatchAll xmlns="c3614af2-e635-4072-be10-70b8c906c008" xsi:nil="true"/>
-    <lcf76f155ced4ddcb4097134ff3c332f xmlns="8fcaa2d4-51b8-4b8f-b7bc-98cf4b2177e8">
-      <Terms xmlns="http://schemas.microsoft.com/office/infopath/2007/PartnerControls"/>
-    </lcf76f155ced4ddcb4097134ff3c332f>
-  </documentManagement>
-</p:properties>
+<?mso-contentType ?>
+<FormTemplates xmlns="http://schemas.microsoft.com/sharepoint/v3/contenttype/forms">
+  <Display>DocumentLibraryForm</Display>
+  <Edit>DocumentLibraryForm</Edit>
+  <New>DocumentLibraryForm</New>
+</FormTemplates>
 </file>
 
 <file path=customXml/item2.xml><?xml version="1.0" encoding="utf-8"?>
+<b:Sources xmlns:b="http://schemas.openxmlformats.org/officeDocument/2006/bibliography" xmlns="http://schemas.openxmlformats.org/officeDocument/2006/bibliography" SelectedStyle="\APASixthEditionOfficeOnline.xsl" StyleName="APA" Version="6"/>
+</file>
+
+<file path=customXml/item3.xml><?xml version="1.0" encoding="utf-8"?>
 <ct:contentTypeSchema xmlns:ct="http://schemas.microsoft.com/office/2006/metadata/contentType" xmlns:ma="http://schemas.microsoft.com/office/2006/metadata/properties/metaAttributes" ct:_="" ma:_="" ma:contentTypeName="Documento" ma:contentTypeID="0x010100C62BA20E8D966040A082E36E8561CD84" ma:contentTypeVersion="18" ma:contentTypeDescription="Crear nuevo documento." ma:contentTypeScope="" ma:versionID="3fb87f32056febf5c27be5220828e678">
   <xsd:schema xmlns:xsd="http://www.w3.org/2001/XMLSchema" xmlns:xs="http://www.w3.org/2001/XMLSchema" xmlns:p="http://schemas.microsoft.com/office/2006/metadata/properties" xmlns:ns2="8fcaa2d4-51b8-4b8f-b7bc-98cf4b2177e8" xmlns:ns3="c3614af2-e635-4072-be10-70b8c906c008" targetNamespace="http://schemas.microsoft.com/office/2006/metadata/properties" ma:root="true" ma:fieldsID="7ccced0006375d94c23fe053fe4bfd03" ns2:_="" ns3:_="">
     <xsd:import namespace="8fcaa2d4-51b8-4b8f-b7bc-98cf4b2177e8"/>
@@ -12503,31 +12733,34 @@
 </ct:contentTypeSchema>
 </file>
 
-<file path=customXml/item3.xml><?xml version="1.0" encoding="utf-8"?>
-<b:Sources xmlns:b="http://schemas.openxmlformats.org/officeDocument/2006/bibliography" xmlns="http://schemas.openxmlformats.org/officeDocument/2006/bibliography" SelectedStyle="\APASixthEditionOfficeOnline.xsl" StyleName="APA" Version="6"/>
-</file>
-
 <file path=customXml/item4.xml><?xml version="1.0" encoding="utf-8"?>
-<?mso-contentType ?>
-<FormTemplates xmlns="http://schemas.microsoft.com/sharepoint/v3/contenttype/forms">
-  <Display>DocumentLibraryForm</Display>
-  <Edit>DocumentLibraryForm</Edit>
-  <New>DocumentLibraryForm</New>
-</FormTemplates>
+<p:properties xmlns:p="http://schemas.microsoft.com/office/2006/metadata/properties" xmlns:xsi="http://www.w3.org/2001/XMLSchema-instance" xmlns:pc="http://schemas.microsoft.com/office/infopath/2007/PartnerControls">
+  <documentManagement>
+    <TaxCatchAll xmlns="c3614af2-e635-4072-be10-70b8c906c008" xsi:nil="true"/>
+    <lcf76f155ced4ddcb4097134ff3c332f xmlns="8fcaa2d4-51b8-4b8f-b7bc-98cf4b2177e8">
+      <Terms xmlns="http://schemas.microsoft.com/office/infopath/2007/PartnerControls"/>
+    </lcf76f155ced4ddcb4097134ff3c332f>
+  </documentManagement>
+</p:properties>
 </file>
 
 <file path=customXml/itemProps1.xml><?xml version="1.0" encoding="utf-8"?>
-<ds:datastoreItem xmlns:ds="http://schemas.openxmlformats.org/officeDocument/2006/customXml" ds:itemID="{88A6ECAC-0B71-40C3-919D-6A07C4453A27}">
+<ds:datastoreItem xmlns:ds="http://schemas.openxmlformats.org/officeDocument/2006/customXml" ds:itemID="{7ACF66F9-DA77-4432-A9F8-7B88E125BEC2}">
   <ds:schemaRefs>
-    <ds:schemaRef ds:uri="http://schemas.microsoft.com/office/2006/metadata/properties"/>
-    <ds:schemaRef ds:uri="http://schemas.microsoft.com/office/infopath/2007/PartnerControls"/>
-    <ds:schemaRef ds:uri="c3614af2-e635-4072-be10-70b8c906c008"/>
-    <ds:schemaRef ds:uri="8fcaa2d4-51b8-4b8f-b7bc-98cf4b2177e8"/>
+    <ds:schemaRef ds:uri="http://schemas.microsoft.com/sharepoint/v3/contenttype/forms"/>
   </ds:schemaRefs>
 </ds:datastoreItem>
 </file>
 
 <file path=customXml/itemProps2.xml><?xml version="1.0" encoding="utf-8"?>
+<ds:datastoreItem xmlns:ds="http://schemas.openxmlformats.org/officeDocument/2006/customXml" ds:itemID="{0C031396-AFEC-4AD9-A87F-290EDFB2B80E}">
+  <ds:schemaRefs>
+    <ds:schemaRef ds:uri="http://schemas.openxmlformats.org/officeDocument/2006/bibliography"/>
+  </ds:schemaRefs>
+</ds:datastoreItem>
+</file>
+
+<file path=customXml/itemProps3.xml><?xml version="1.0" encoding="utf-8"?>
 <ds:datastoreItem xmlns:ds="http://schemas.openxmlformats.org/officeDocument/2006/customXml" ds:itemID="{3467B138-4EC8-4BDA-AD9B-30A6F24A2637}">
   <ds:schemaRefs>
     <ds:schemaRef ds:uri="http://schemas.microsoft.com/office/2006/metadata/contentType"/>
@@ -12546,18 +12779,13 @@
 </ds:datastoreItem>
 </file>
 
-<file path=customXml/itemProps3.xml><?xml version="1.0" encoding="utf-8"?>
-<ds:datastoreItem xmlns:ds="http://schemas.openxmlformats.org/officeDocument/2006/customXml" ds:itemID="{0C031396-AFEC-4AD9-A87F-290EDFB2B80E}">
+<file path=customXml/itemProps4.xml><?xml version="1.0" encoding="utf-8"?>
+<ds:datastoreItem xmlns:ds="http://schemas.openxmlformats.org/officeDocument/2006/customXml" ds:itemID="{88A6ECAC-0B71-40C3-919D-6A07C4453A27}">
   <ds:schemaRefs>
-    <ds:schemaRef ds:uri="http://schemas.openxmlformats.org/officeDocument/2006/bibliography"/>
-  </ds:schemaRefs>
-</ds:datastoreItem>
-</file>
-
-<file path=customXml/itemProps4.xml><?xml version="1.0" encoding="utf-8"?>
-<ds:datastoreItem xmlns:ds="http://schemas.openxmlformats.org/officeDocument/2006/customXml" ds:itemID="{7ACF66F9-DA77-4432-A9F8-7B88E125BEC2}">
-  <ds:schemaRefs>
-    <ds:schemaRef ds:uri="http://schemas.microsoft.com/sharepoint/v3/contenttype/forms"/>
+    <ds:schemaRef ds:uri="http://schemas.microsoft.com/office/2006/metadata/properties"/>
+    <ds:schemaRef ds:uri="http://schemas.microsoft.com/office/infopath/2007/PartnerControls"/>
+    <ds:schemaRef ds:uri="c3614af2-e635-4072-be10-70b8c906c008"/>
+    <ds:schemaRef ds:uri="8fcaa2d4-51b8-4b8f-b7bc-98cf4b2177e8"/>
   </ds:schemaRefs>
 </ds:datastoreItem>
 </file>
</xml_diff>